<commit_message>
feat: Burner & Blower offers get scope intro + bulleted items
Same treatment as HPU/PU: the individual Burner and Blower offers had a one-line
scope. The endpoints now build a scope_intro paragraph + scope_items (Burner:
burner alone, ball valve, CI mounting plate, burner block, flexible hoses,
butterfly valve; Blower: blower unit, motor, base frame) into the specs, and
both templates render {{ scope_intro }} + a bulleted scope_items loop (numId=1
bullet). Verified: Burner 6 bullets, Blower 3 bullets render correctly.
</commit_message>
<xml_diff>
--- a/Blower_Offer_Template.docx
+++ b/Blower_Offer_Template.docx
@@ -2689,7 +2689,35 @@
         <w:rPr>
           <w:rFonts w:ascii="Calibri" w:cs="Calibri" w:eastAsia="Calibri" w:hAnsi="Calibri"/>
         </w:rPr>
-        <w:t xml:space="preserve">The scope of supply covers design, engineering, manufacturing, supply, and supervision for erection and commissioning of the system, consisting of the following components:</w:t>
+        <w:t>{{ scope_intro }}</w:t>
+      </w:r>
+    </w:p>
+    <w:p>
+      <w:pPr>
+        <w:pStyle w:val="ListParagraph"/>
+      </w:pPr>
+      <w:r>
+        <w:t>{%p for x in scope_items %}</w:t>
+      </w:r>
+    </w:p>
+    <w:p>
+      <w:pPr>
+        <w:pStyle w:val="ListParagraph"/>
+        <w:numPr>
+          <w:ilvl w:val="0"/>
+          <w:numId w:val="1"/>
+        </w:numPr>
+      </w:pPr>
+      <w:r>
+        <w:t>{{ x.item }}</w:t>
+      </w:r>
+    </w:p>
+    <w:p>
+      <w:pPr>
+        <w:pStyle w:val="ListParagraph"/>
+      </w:pPr>
+      <w:r>
+        <w:t>{%p endfor %}</w:t>
       </w:r>
     </w:p>
     <w:p>

</xml_diff>

<commit_message>
feat: formal ENCON cover letter for equipment offers + fix '&' in values
Replace the generic cover letter in all four equipment templates (Blower/
Burner/HPU/PU) with the formal ENCON letter: company block + Mobile No, bold
underlined KIND ATTN, OUR REF / DATE (tabbed), bold underlined SUB, the
"Thank you for your enquiry…" body with the bold "Kindly note our price list…"
line, and the J P Singh (Director–Marketing) Vadodara signature with the red
award lines and ENERGY SAVED IS MONEY EARNED. Added enquiry_ref_short/
enquiry_date_str to the quote_writer context so HPU/PU match.

Also render with autoescape=True (blower/burner path + export/word_writer shared
by VLPH/HLPH/Tundish/HPU/PU) so '&' in values like "Steel & Alloys" survives.

Co-Authored-By: Claude Opus 4.8 <noreply@anthropic.com>
</commit_message>
<xml_diff>
--- a/Blower_Offer_Template.docx
+++ b/Blower_Offer_Template.docx
@@ -405,242 +405,512 @@
     </w:p>
     <w:p>
       <w:pPr>
-        <w:spacing w:after="60" w:before="120" w:line="300"/>
         <w:jc w:val="left"/>
       </w:pPr>
       <w:r>
         <w:rPr>
-          <w:rFonts w:ascii="Calibri" w:cs="Calibri" w:eastAsia="Calibri" w:hAnsi="Calibri"/>
-        </w:rPr>
-        <w:t xml:space="preserve">To,</w:t>
-      </w:r>
-    </w:p>
-    <w:p>
-      <w:pPr>
-        <w:spacing w:after="60" w:before="0"/>
-      </w:pPr>
-      <w:r>
-        <w:rPr>
-          <w:rFonts w:ascii="Calibri" w:cs="Calibri" w:eastAsia="Calibri" w:hAnsi="Calibri"/>
+          <w:rFonts w:ascii="Calibri" w:hAnsi="Calibri"/>
           <w:b/>
-          <w:bCs/>
-          <w:color w:val="1F2937"/>
-          <w:sz w:val="26"/>
-          <w:szCs w:val="26"/>
+          <w:sz w:val="22"/>
+          <w:u w:val="none"/>
         </w:rPr>
         <w:t>{{company_name}}</w:t>
       </w:r>
     </w:p>
     <w:p>
       <w:pPr>
-        <w:spacing w:after="60" w:before="60" w:line="300"/>
         <w:jc w:val="left"/>
       </w:pPr>
       <w:r>
         <w:rPr>
-          <w:rFonts w:ascii="Calibri" w:cs="Calibri" w:eastAsia="Calibri" w:hAnsi="Calibri"/>
-        </w:rPr>
-        <w:t>Kind Attn: {{poc_name}} ({{poc_designation}})</w:t>
-      </w:r>
-    </w:p>
-    <w:p>
-      <w:pPr>
-        <w:spacing w:after="60" w:before="0" w:line="300"/>
+          <w:rFonts w:ascii="Calibri" w:hAnsi="Calibri"/>
+          <w:b w:val="0"/>
+          <w:sz w:val="22"/>
+          <w:u w:val="none"/>
+        </w:rPr>
+        <w:t>{{company_address}}</w:t>
+      </w:r>
+    </w:p>
+    <w:p>
+      <w:pPr>
         <w:jc w:val="left"/>
       </w:pPr>
       <w:r>
         <w:rPr>
-          <w:rFonts w:ascii="Calibri" w:cs="Calibri" w:eastAsia="Calibri" w:hAnsi="Calibri"/>
-        </w:rPr>
-        <w:t xml:space="preserve">{{company_address}}</w:t>
-      </w:r>
-    </w:p>
-    <w:p>
-      <w:pPr>
-        <w:spacing w:after="60" w:before="0" w:line="300"/>
+          <w:rFonts w:ascii="Calibri" w:hAnsi="Calibri"/>
+          <w:b w:val="0"/>
+          <w:sz w:val="22"/>
+          <w:u w:val="none"/>
+        </w:rPr>
+        <w:t>Mobile No: {{mobile_no}}</w:t>
+      </w:r>
+    </w:p>
+    <w:p>
+      <w:pPr>
         <w:jc w:val="left"/>
       </w:pPr>
       <w:r>
         <w:rPr>
-          <w:rFonts w:ascii="Calibri" w:cs="Calibri" w:eastAsia="Calibri" w:hAnsi="Calibri"/>
-        </w:rPr>
-        <w:t>Contact No.: {{mobile_no}}</w:t>
-      </w:r>
-    </w:p>
-    <w:p>
-      <w:pPr>
-        <w:spacing w:after="200" w:before="0" w:line="300"/>
+          <w:rFonts w:ascii="Calibri" w:hAnsi="Calibri"/>
+          <w:b w:val="0"/>
+          <w:sz w:val="22"/>
+          <w:u w:val="none"/>
+        </w:rPr>
+      </w:r>
+    </w:p>
+    <w:p>
+      <w:pPr>
         <w:jc w:val="left"/>
       </w:pPr>
       <w:r>
         <w:rPr>
-          <w:rFonts w:ascii="Calibri" w:cs="Calibri" w:eastAsia="Calibri" w:hAnsi="Calibri"/>
+          <w:rFonts w:ascii="Calibri" w:hAnsi="Calibri"/>
+          <w:b/>
           <w:sz w:val="22"/>
-          <w:szCs w:val="22"/>
-        </w:rPr>
-        <w:t>Email: {{email}}</w:t>
-      </w:r>
-    </w:p>
-    <w:p>
-      <w:pPr>
-        <w:spacing w:after="160" w:before="160"/>
-      </w:pPr>
-      <w:r>
-        <w:t xml:space="preserve"/>
-      </w:r>
-    </w:p>
-    <w:p>
-      <w:pPr>
-        <w:spacing w:after="200" w:before="120"/>
-      </w:pPr>
-      <w:r>
-        <w:rPr>
-          <w:rFonts w:ascii="Calibri" w:cs="Calibri" w:eastAsia="Calibri" w:hAnsi="Calibri"/>
+          <w:u w:val="single"/>
+        </w:rPr>
+        <w:t>KIND ATTN  : {{poc_name}} ({{poc_designation}})</w:t>
+      </w:r>
+    </w:p>
+    <w:p>
+      <w:pPr>
+        <w:jc w:val="left"/>
+      </w:pPr>
+      <w:r>
+        <w:rPr>
+          <w:rFonts w:ascii="Calibri" w:hAnsi="Calibri"/>
+          <w:b w:val="0"/>
+          <w:sz w:val="22"/>
+          <w:u w:val="none"/>
+        </w:rPr>
+      </w:r>
+    </w:p>
+    <w:p>
+      <w:pPr>
+        <w:tabs>
+          <w:tab w:pos="4896" w:val="left"/>
+        </w:tabs>
+      </w:pPr>
+      <w:r>
+        <w:rPr>
+          <w:rFonts w:ascii="Calibri" w:hAnsi="Calibri"/>
           <w:b/>
-          <w:bCs/>
-          <w:color w:val="1F2937"/>
-          <w:sz w:val="24"/>
-          <w:szCs w:val="24"/>
-        </w:rPr>
-        <w:t>Subject: {{subject}}</w:t>
-      </w:r>
-      <w:r>
-        <w:rPr>
-          <w:rFonts w:ascii="Calibri" w:cs="Calibri" w:eastAsia="Calibri" w:hAnsi="Calibri"/>
+          <w:sz w:val="22"/>
+          <w:u w:val="none"/>
+        </w:rPr>
+        <w:t>OUR REF:</w:t>
+      </w:r>
+      <w:r>
+        <w:rPr>
+          <w:rFonts w:ascii="Calibri" w:hAnsi="Calibri"/>
           <w:b/>
-          <w:bCs/>
-          <w:sz w:val="24"/>
-          <w:szCs w:val="24"/>
-        </w:rPr>
-      </w:r>
-    </w:p>
-    <w:p>
-      <w:pPr>
-        <w:spacing w:after="160" w:before="120" w:line="300"/>
+          <w:sz w:val="22"/>
+          <w:u w:val="none"/>
+        </w:rPr>
+        <w:tab/>
+        <w:t>DATE:</w:t>
+      </w:r>
+    </w:p>
+    <w:p>
+      <w:pPr>
+        <w:tabs>
+          <w:tab w:pos="4896" w:val="left"/>
+        </w:tabs>
+      </w:pPr>
+      <w:r>
+        <w:rPr>
+          <w:rFonts w:ascii="Calibri" w:hAnsi="Calibri"/>
+          <w:b w:val="0"/>
+          <w:sz w:val="22"/>
+          <w:u w:val="none"/>
+        </w:rPr>
+        <w:t>{{enquiry_ref_short}}</w:t>
+      </w:r>
+      <w:r>
+        <w:rPr>
+          <w:rFonts w:ascii="Calibri" w:hAnsi="Calibri"/>
+          <w:b w:val="0"/>
+          <w:sz w:val="22"/>
+          <w:u w:val="none"/>
+        </w:rPr>
+        <w:tab/>
+        <w:t>{{enquiry_date_str}}</w:t>
+      </w:r>
+    </w:p>
+    <w:p>
+      <w:pPr>
         <w:jc w:val="left"/>
       </w:pPr>
       <w:r>
         <w:rPr>
-          <w:rFonts w:ascii="Calibri" w:cs="Calibri" w:eastAsia="Calibri" w:hAnsi="Calibri"/>
-        </w:rPr>
-        <w:t xml:space="preserve">Dear Sir,</w:t>
-      </w:r>
-    </w:p>
-    <w:p>
-      <w:pPr>
-        <w:spacing w:after="160" w:before="0" w:line="300"/>
+          <w:rFonts w:ascii="Calibri" w:hAnsi="Calibri"/>
+          <w:b w:val="0"/>
+          <w:sz w:val="22"/>
+          <w:u w:val="none"/>
+        </w:rPr>
+      </w:r>
+    </w:p>
+    <w:p>
+      <w:pPr>
         <w:jc w:val="left"/>
       </w:pPr>
       <w:r>
         <w:rPr>
-          <w:rFonts w:ascii="Calibri" w:cs="Calibri" w:eastAsia="Calibri" w:hAnsi="Calibri"/>
-        </w:rPr>
-        <w:t>This is with reference to your enquiry for {{project_name}} as per the technical specifications shared.</w:t>
-      </w:r>
-    </w:p>
-    <w:p>
-      <w:pPr>
-        <w:spacing w:after="160" w:before="0" w:line="300"/>
+          <w:rFonts w:ascii="Calibri" w:hAnsi="Calibri"/>
+          <w:b/>
+          <w:sz w:val="22"/>
+          <w:u w:val="single"/>
+        </w:rPr>
+        <w:t>SUB: {{subject}}</w:t>
+      </w:r>
+    </w:p>
+    <w:p>
+      <w:pPr>
         <w:jc w:val="left"/>
       </w:pPr>
       <w:r>
         <w:rPr>
-          <w:rFonts w:ascii="Calibri" w:cs="Calibri" w:eastAsia="Calibri" w:hAnsi="Calibri"/>
-        </w:rPr>
-        <w:t>We are pleased to enclose herewith our most competitive and comprehensive offer for the same for your kind perusal.</w:t>
-      </w:r>
-    </w:p>
-    <w:p>
-      <w:pPr>
-        <w:spacing w:after="320" w:before="0" w:line="300"/>
+          <w:rFonts w:ascii="Calibri" w:hAnsi="Calibri"/>
+          <w:b w:val="0"/>
+          <w:sz w:val="22"/>
+          <w:u w:val="none"/>
+        </w:rPr>
+      </w:r>
+    </w:p>
+    <w:p>
+      <w:pPr>
         <w:jc w:val="left"/>
       </w:pPr>
       <w:r>
         <w:rPr>
-          <w:rFonts w:ascii="Calibri" w:cs="Calibri" w:eastAsia="Calibri" w:hAnsi="Calibri"/>
-        </w:rPr>
-        <w:t xml:space="preserve">Though we have endeavored to make the offer self-explanatory, please feel free to contact us should you require any clarification or additional information.</w:t>
-      </w:r>
-    </w:p>
-    <w:p>
-      <w:pPr>
-        <w:spacing w:after="40" w:before="0" w:line="300"/>
+          <w:rFonts w:ascii="Calibri" w:hAnsi="Calibri"/>
+          <w:b w:val="0"/>
+          <w:sz w:val="22"/>
+          <w:u w:val="none"/>
+        </w:rPr>
+        <w:t>Dear {{poc_name}},</w:t>
+      </w:r>
+    </w:p>
+    <w:p>
+      <w:pPr>
         <w:jc w:val="left"/>
       </w:pPr>
       <w:r>
         <w:rPr>
-          <w:rFonts w:ascii="Calibri" w:cs="Calibri" w:eastAsia="Calibri" w:hAnsi="Calibri"/>
-        </w:rPr>
-        <w:t xml:space="preserve">Regards,</w:t>
-      </w:r>
-    </w:p>
-    <w:p>
-      <w:pPr>
-        <w:spacing w:after="0" w:before="240"/>
-      </w:pPr>
-      <w:r>
-        <w:rPr>
-          <w:rFonts w:ascii="Calibri" w:cs="Calibri" w:eastAsia="Calibri" w:hAnsi="Calibri"/>
+          <w:rFonts w:ascii="Calibri" w:hAnsi="Calibri"/>
+          <w:b w:val="0"/>
+          <w:sz w:val="22"/>
+          <w:u w:val="none"/>
+        </w:rPr>
+      </w:r>
+    </w:p>
+    <w:p>
+      <w:pPr>
+        <w:jc w:val="both"/>
+      </w:pPr>
+      <w:r>
+        <w:rPr>
+          <w:rFonts w:ascii="Calibri" w:hAnsi="Calibri"/>
+          <w:b w:val="0"/>
+          <w:sz w:val="22"/>
+          <w:u w:val="none"/>
+        </w:rPr>
+        <w:t>Thank you for your enquiry regarding your requirement of our {{equipment_name}}. Please find attached herewith our offer for the same.</w:t>
+      </w:r>
+    </w:p>
+    <w:p>
+      <w:pPr>
+        <w:jc w:val="left"/>
+      </w:pPr>
+      <w:r>
+        <w:rPr>
+          <w:rFonts w:ascii="Calibri" w:hAnsi="Calibri"/>
+          <w:b w:val="0"/>
+          <w:sz w:val="22"/>
+          <w:u w:val="none"/>
+        </w:rPr>
+      </w:r>
+    </w:p>
+    <w:p>
+      <w:pPr>
+        <w:jc w:val="both"/>
+      </w:pPr>
+      <w:r>
+        <w:rPr>
+          <w:rFonts w:ascii="Calibri" w:hAnsi="Calibri"/>
+          <w:b w:val="0"/>
+          <w:sz w:val="22"/>
+          <w:u w:val="none"/>
+        </w:rPr>
+        <w:t>We hope the offer suits your present requirement. Though we have tried to be very elaborate in our offer, should you need any further assistance from our end to enable you to finalize the requirement, please contact us immediately. We would be happy to assist you anytime.</w:t>
+      </w:r>
+    </w:p>
+    <w:p>
+      <w:pPr>
+        <w:jc w:val="left"/>
+      </w:pPr>
+      <w:r>
+        <w:rPr>
+          <w:rFonts w:ascii="Calibri" w:hAnsi="Calibri"/>
+          <w:b w:val="0"/>
+          <w:sz w:val="22"/>
+          <w:u w:val="none"/>
+        </w:rPr>
+      </w:r>
+    </w:p>
+    <w:p>
+      <w:pPr>
+        <w:jc w:val="both"/>
+      </w:pPr>
+      <w:r>
+        <w:rPr>
+          <w:rFonts w:ascii="Calibri" w:hAnsi="Calibri"/>
           <w:b/>
-          <w:bCs/>
-          <w:color w:val="1F2937"/>
-          <w:sz w:val="24"/>
-          <w:szCs w:val="24"/>
-        </w:rPr>
-        <w:t>{{technical_person}}</w:t>
-      </w:r>
-    </w:p>
-    <w:p>
-      <w:pPr>
-        <w:spacing w:after="60" w:before="0" w:line="300"/>
+          <w:sz w:val="22"/>
+          <w:u w:val="none"/>
+        </w:rPr>
+        <w:t>Kindly note that our price list is likely to revise shortly. So request you to send us the order asap to enable us to honour the existing prices.</w:t>
+      </w:r>
+    </w:p>
+    <w:p>
+      <w:pPr>
         <w:jc w:val="left"/>
       </w:pPr>
       <w:r>
         <w:rPr>
-          <w:rFonts w:ascii="Calibri" w:cs="Calibri" w:eastAsia="Calibri" w:hAnsi="Calibri"/>
-        </w:rPr>
-        <w:t xml:space="preserve">ENCON Thermal Engineers Pvt. Ltd.</w:t>
-      </w:r>
-    </w:p>
-    <w:p>
-      <w:pPr>
-        <w:spacing w:after="0" w:before="0" w:line="300"/>
+          <w:rFonts w:ascii="Calibri" w:hAnsi="Calibri"/>
+          <w:b w:val="0"/>
+          <w:sz w:val="22"/>
+          <w:u w:val="none"/>
+        </w:rPr>
+      </w:r>
+    </w:p>
+    <w:p>
+      <w:pPr>
         <w:jc w:val="left"/>
       </w:pPr>
       <w:r>
         <w:rPr>
-          <w:rFonts w:ascii="Calibri" w:cs="Calibri" w:eastAsia="Calibri" w:hAnsi="Calibri"/>
+          <w:rFonts w:ascii="Calibri" w:hAnsi="Calibri"/>
+          <w:b w:val="0"/>
           <w:sz w:val="22"/>
-          <w:szCs w:val="22"/>
-        </w:rPr>
-        <w:t>Mob: {{technical_phone}}</w:t>
-      </w:r>
-    </w:p>
-    <w:p>
-      <w:pPr>
-        <w:spacing w:after="320" w:before="0" w:line="300"/>
+          <w:u w:val="none"/>
+        </w:rPr>
+        <w:t>Thanking you. Looking forward to the pleasure of serving you in the near future.</w:t>
+      </w:r>
+    </w:p>
+    <w:p>
+      <w:pPr>
         <w:jc w:val="left"/>
       </w:pPr>
       <w:r>
         <w:rPr>
-          <w:rFonts w:ascii="Calibri" w:cs="Calibri" w:eastAsia="Calibri" w:hAnsi="Calibri"/>
+          <w:rFonts w:ascii="Calibri" w:hAnsi="Calibri"/>
+          <w:b w:val="0"/>
           <w:sz w:val="22"/>
-          <w:szCs w:val="22"/>
-        </w:rPr>
-        <w:t>Email: {{technical_email}}   |   www.encon.co.in</w:t>
-      </w:r>
-      <w:r>
-        <w:rPr>
-          <w:rFonts w:ascii="Calibri" w:cs="Calibri" w:eastAsia="Calibri" w:hAnsi="Calibri"/>
-          <w:color w:val="6B7280"/>
+          <w:u w:val="none"/>
+        </w:rPr>
+      </w:r>
+    </w:p>
+    <w:p>
+      <w:pPr>
+        <w:jc w:val="left"/>
+      </w:pPr>
+      <w:r>
+        <w:rPr>
+          <w:rFonts w:ascii="Calibri" w:hAnsi="Calibri"/>
+          <w:b w:val="0"/>
           <w:sz w:val="22"/>
-          <w:szCs w:val="22"/>
-        </w:rPr>
-      </w:r>
-    </w:p>
-    <w:p>
-      <w:r>
-        <w:br w:type="page"/>
+          <w:u w:val="none"/>
+        </w:rPr>
+        <w:t>With best regards,</w:t>
+      </w:r>
+    </w:p>
+    <w:p>
+      <w:pPr>
+        <w:jc w:val="left"/>
+      </w:pPr>
+      <w:r>
+        <w:rPr>
+          <w:rFonts w:ascii="Calibri" w:hAnsi="Calibri"/>
+          <w:b w:val="0"/>
+          <w:sz w:val="22"/>
+          <w:u w:val="none"/>
+        </w:rPr>
+      </w:r>
+    </w:p>
+    <w:p>
+      <w:pPr>
+        <w:jc w:val="left"/>
+      </w:pPr>
+      <w:r>
+        <w:rPr>
+          <w:rFonts w:ascii="Calibri" w:hAnsi="Calibri"/>
+          <w:b w:val="0"/>
+          <w:sz w:val="22"/>
+          <w:u w:val="none"/>
+        </w:rPr>
+      </w:r>
+    </w:p>
+    <w:p>
+      <w:pPr>
+        <w:jc w:val="left"/>
+      </w:pPr>
+      <w:r>
+        <w:rPr>
+          <w:rFonts w:ascii="Calibri" w:hAnsi="Calibri"/>
+          <w:b w:val="0"/>
+          <w:sz w:val="22"/>
+          <w:u w:val="none"/>
+        </w:rPr>
+        <w:t>J P Singh (Director – Marketing)</w:t>
+      </w:r>
+    </w:p>
+    <w:p>
+      <w:pPr>
+        <w:jc w:val="left"/>
+      </w:pPr>
+      <w:r>
+        <w:rPr>
+          <w:rFonts w:ascii="Calibri" w:hAnsi="Calibri"/>
+          <w:b/>
+          <w:sz w:val="22"/>
+          <w:u w:val="none"/>
+        </w:rPr>
+        <w:t>ENCON Thermal Engineers (P) Ltd.,</w:t>
+      </w:r>
+    </w:p>
+    <w:p>
+      <w:pPr>
+        <w:jc w:val="left"/>
+      </w:pPr>
+      <w:r>
+        <w:rPr>
+          <w:rFonts w:ascii="Calibri" w:hAnsi="Calibri"/>
+          <w:b w:val="0"/>
+          <w:sz w:val="22"/>
+          <w:u w:val="none"/>
+        </w:rPr>
+        <w:t>Vadodara (Gujarat) INDIA</w:t>
+      </w:r>
+    </w:p>
+    <w:p>
+      <w:pPr>
+        <w:jc w:val="left"/>
+      </w:pPr>
+      <w:r>
+        <w:rPr>
+          <w:rFonts w:ascii="Calibri" w:hAnsi="Calibri"/>
+          <w:b/>
+          <w:color w:val="C00000"/>
+          <w:sz w:val="22"/>
+          <w:u w:val="none"/>
+        </w:rPr>
+        <w:t>Winner 1st Prize - NATIONAL ENERGY EFFICIENCY INNOVATION AWARD</w:t>
+      </w:r>
+    </w:p>
+    <w:p>
+      <w:pPr>
+        <w:jc w:val="left"/>
+      </w:pPr>
+      <w:r>
+        <w:rPr>
+          <w:rFonts w:ascii="Calibri" w:hAnsi="Calibri"/>
+          <w:b/>
+          <w:color w:val="C00000"/>
+          <w:sz w:val="22"/>
+          <w:u w:val="none"/>
+        </w:rPr>
+        <w:t>(Conferred by the President of India)</w:t>
+      </w:r>
+    </w:p>
+    <w:p>
+      <w:pPr>
+        <w:jc w:val="left"/>
+      </w:pPr>
+      <w:r>
+        <w:rPr>
+          <w:rFonts w:ascii="Calibri" w:hAnsi="Calibri"/>
+          <w:b w:val="0"/>
+          <w:sz w:val="22"/>
+          <w:u w:val="none"/>
+        </w:rPr>
+        <w:t>Mobile: +91 98250 97240</w:t>
+      </w:r>
+    </w:p>
+    <w:p>
+      <w:pPr>
+        <w:jc w:val="left"/>
+      </w:pPr>
+      <w:r>
+        <w:rPr>
+          <w:rFonts w:ascii="Calibri" w:hAnsi="Calibri"/>
+          <w:b w:val="0"/>
+          <w:sz w:val="22"/>
+          <w:u w:val="none"/>
+        </w:rPr>
+        <w:t xml:space="preserve">Email: </w:t>
+      </w:r>
+      <w:r>
+        <w:rPr>
+          <w:rFonts w:ascii="Calibri" w:hAnsi="Calibri"/>
+          <w:b w:val="0"/>
+          <w:color w:val="0000FF"/>
+          <w:sz w:val="22"/>
+          <w:u w:val="single"/>
+        </w:rPr>
+        <w:t>vadodara@encon.co.in</w:t>
+      </w:r>
+    </w:p>
+    <w:p>
+      <w:pPr>
+        <w:jc w:val="left"/>
+      </w:pPr>
+      <w:r>
+        <w:rPr>
+          <w:rFonts w:ascii="Calibri" w:hAnsi="Calibri"/>
+          <w:b w:val="0"/>
+          <w:sz w:val="22"/>
+          <w:u w:val="none"/>
+        </w:rPr>
+        <w:t xml:space="preserve">Website: </w:t>
+      </w:r>
+      <w:r>
+        <w:rPr>
+          <w:rFonts w:ascii="Calibri" w:hAnsi="Calibri"/>
+          <w:b w:val="0"/>
+          <w:color w:val="0000FF"/>
+          <w:sz w:val="22"/>
+          <w:u w:val="single"/>
+        </w:rPr>
+        <w:t>www.encon.co.in</w:t>
+      </w:r>
+    </w:p>
+    <w:p>
+      <w:pPr>
+        <w:jc w:val="left"/>
+      </w:pPr>
+      <w:r>
+        <w:rPr>
+          <w:rFonts w:ascii="Calibri" w:hAnsi="Calibri"/>
+          <w:b/>
+          <w:sz w:val="22"/>
+          <w:u w:val="none"/>
+        </w:rPr>
+        <w:t>ENERGY SAVED IS MONEY EARNED!!</w:t>
+      </w:r>
+    </w:p>
+    <w:p>
+      <w:pPr>
+        <w:jc w:val="left"/>
+      </w:pPr>
+      <w:r>
+        <w:rPr>
+          <w:rFonts w:ascii="Calibri" w:hAnsi="Calibri"/>
+          <w:b w:val="0"/>
+          <w:sz w:val="22"/>
+          <w:u w:val="none"/>
+        </w:rPr>
       </w:r>
     </w:p>
     <w:p>

</xml_diff>

<commit_message>
fix: price-table components render as real bullets (not inline run-on)
The RichText "\n" line breaks survived the docxtpl path (blower/burner) but were
dropped by the word_writer path (HPU/PU), so HPU/PU price descriptions ran the
bullets together inline. Replace the single RichText cell with the same
{%p for%} bullet-paragraph structure the Scope section uses (cloning its
List-Paragraph numbering), so components are proper bulleted lines in every
offer. Generators now pass price_heading/price_body/price_bullets/price_notes
(heading bold + ":"); VLPH/HLPH get harmless defaults and are unchanged.

Co-Authored-By: Claude Opus 4.8 <noreply@anthropic.com>
</commit_message>
<xml_diff>
--- a/Blower_Offer_Template.docx
+++ b/Blower_Offer_Template.docx
@@ -3235,7 +3235,80 @@
           </w:tcPr>
           <w:p>
             <w:r>
-              <w:t>{{ item_desc }}</w:t>
+              <w:rPr>
+                <w:rFonts w:ascii="Calibri" w:hAnsi="Calibri"/>
+                <w:b/>
+              </w:rPr>
+              <w:t>{{ price_heading }}</w:t>
+            </w:r>
+          </w:p>
+          <w:p>
+            <w:r>
+              <w:rPr>
+                <w:rFonts w:ascii="Calibri" w:hAnsi="Calibri"/>
+                <w:b w:val="0"/>
+              </w:rPr>
+              <w:t>{{ price_body }}</w:t>
+            </w:r>
+          </w:p>
+          <w:p>
+            <w:r>
+              <w:rPr>
+                <w:rFonts w:ascii="Calibri" w:hAnsi="Calibri"/>
+                <w:b w:val="0"/>
+              </w:rPr>
+              <w:t>{%p for x in price_bullets %}</w:t>
+            </w:r>
+          </w:p>
+          <w:p>
+            <w:pPr>
+              <w:pStyle w:val="ListParagraph"/>
+              <w:numPr>
+                <w:ilvl w:val="0"/>
+                <w:numId w:val="1"/>
+              </w:numPr>
+            </w:pPr>
+            <w:r>
+              <w:rPr>
+                <w:rFonts w:ascii="Calibri" w:hAnsi="Calibri"/>
+              </w:rPr>
+              <w:t>{{ x.item }}</w:t>
+            </w:r>
+          </w:p>
+          <w:p>
+            <w:r>
+              <w:rPr>
+                <w:rFonts w:ascii="Calibri" w:hAnsi="Calibri"/>
+                <w:b w:val="0"/>
+              </w:rPr>
+              <w:t>{%p endfor %}</w:t>
+            </w:r>
+          </w:p>
+          <w:p>
+            <w:r>
+              <w:rPr>
+                <w:rFonts w:ascii="Calibri" w:hAnsi="Calibri"/>
+                <w:b w:val="0"/>
+              </w:rPr>
+              <w:t>{%p for n in price_notes %}</w:t>
+            </w:r>
+          </w:p>
+          <w:p>
+            <w:r>
+              <w:rPr>
+                <w:rFonts w:ascii="Calibri" w:hAnsi="Calibri"/>
+                <w:b w:val="0"/>
+              </w:rPr>
+              <w:t>{{ n.item }}</w:t>
+            </w:r>
+          </w:p>
+          <w:p>
+            <w:r>
+              <w:rPr>
+                <w:rFonts w:ascii="Calibri" w:hAnsi="Calibri"/>
+                <w:b w:val="0"/>
+              </w:rPr>
+              <w:t>{%p endfor %}</w:t>
             </w:r>
           </w:p>
         </w:tc>

</xml_diff>

<commit_message>
feat: dynamic per-equipment Advantages section in equipment offers
New equipment_advantages.py holds the ENCON advantages copy per type (blower /
burner / pumping) + closing lines; build_advantages_ctx() yields adv_* context.
Added an Advantages section to all four equipment templates: red heading +
dash bullets, optional Disadvantage / Other-advantages sub-blocks ({%p if%}),
and the italic "extra money invested… / Do we need to say any more?" closing.
Blower->blower copy, burner->Film-burner copy (+ sub-blocks), HPU/PU->Heating &
Pumping copy. Wired via drive_product (blower/burner) and the standalone_pumping
branch (HPU/PU). VLPH/HLPH/Tundish unaffected.

Co-Authored-By: Claude Opus 4.8 <noreply@anthropic.com>
</commit_message>
<xml_diff>
--- a/Blower_Offer_Template.docx
+++ b/Blower_Offer_Template.docx
@@ -4185,6 +4185,304 @@
         </w:tc>
       </w:tr>
     </w:tbl>
+    <w:p>
+      <w:r>
+        <w:br w:type="page"/>
+      </w:r>
+    </w:p>
+    <w:p>
+      <w:pPr>
+        <w:spacing w:before="0" w:after="40"/>
+      </w:pPr>
+      <w:r>
+        <w:rPr>
+          <w:rFonts w:ascii="Calibri" w:hAnsi="Calibri"/>
+          <w:b/>
+          <w:i w:val="0"/>
+          <w:color w:val="C00000"/>
+          <w:sz w:val="28"/>
+        </w:rPr>
+        <w:t>{{ adv_title }}</w:t>
+      </w:r>
+    </w:p>
+    <w:p>
+      <w:pPr>
+        <w:spacing w:before="0" w:after="40"/>
+      </w:pPr>
+      <w:r>
+        <w:rPr>
+          <w:rFonts w:ascii="Calibri" w:hAnsi="Calibri"/>
+          <w:b w:val="0"/>
+          <w:i w:val="0"/>
+          <w:sz w:val="22"/>
+        </w:rPr>
+      </w:r>
+    </w:p>
+    <w:p>
+      <w:pPr>
+        <w:spacing w:before="0" w:after="40"/>
+      </w:pPr>
+      <w:r>
+        <w:rPr>
+          <w:rFonts w:ascii="Calibri" w:hAnsi="Calibri"/>
+          <w:b w:val="0"/>
+          <w:i w:val="0"/>
+          <w:sz w:val="22"/>
+        </w:rPr>
+        <w:t>{%p for x in adv_items %}</w:t>
+      </w:r>
+    </w:p>
+    <w:p>
+      <w:pPr>
+        <w:spacing w:before="0" w:after="40"/>
+      </w:pPr>
+      <w:r>
+        <w:rPr>
+          <w:rFonts w:ascii="Calibri" w:hAnsi="Calibri"/>
+          <w:b w:val="0"/>
+          <w:i w:val="0"/>
+          <w:sz w:val="22"/>
+        </w:rPr>
+        <w:t>-  {{ x.item }}</w:t>
+      </w:r>
+    </w:p>
+    <w:p>
+      <w:pPr>
+        <w:spacing w:before="0" w:after="40"/>
+      </w:pPr>
+      <w:r>
+        <w:rPr>
+          <w:rFonts w:ascii="Calibri" w:hAnsi="Calibri"/>
+          <w:b w:val="0"/>
+          <w:i w:val="0"/>
+          <w:sz w:val="22"/>
+        </w:rPr>
+        <w:t>{%p endfor %}</w:t>
+      </w:r>
+    </w:p>
+    <w:p>
+      <w:pPr>
+        <w:spacing w:before="0" w:after="40"/>
+      </w:pPr>
+      <w:r>
+        <w:rPr>
+          <w:rFonts w:ascii="Calibri" w:hAnsi="Calibri"/>
+          <w:b w:val="0"/>
+          <w:i w:val="0"/>
+          <w:sz w:val="22"/>
+        </w:rPr>
+        <w:t>{%p if adv_sub1_title %}</w:t>
+      </w:r>
+    </w:p>
+    <w:p>
+      <w:pPr>
+        <w:spacing w:before="200" w:after="40"/>
+      </w:pPr>
+      <w:r>
+        <w:rPr>
+          <w:rFonts w:ascii="Calibri" w:hAnsi="Calibri"/>
+          <w:b/>
+          <w:i w:val="0"/>
+          <w:sz w:val="22"/>
+        </w:rPr>
+        <w:t>{{ adv_sub1_title }}</w:t>
+      </w:r>
+    </w:p>
+    <w:p>
+      <w:pPr>
+        <w:spacing w:before="0" w:after="40"/>
+      </w:pPr>
+      <w:r>
+        <w:rPr>
+          <w:rFonts w:ascii="Calibri" w:hAnsi="Calibri"/>
+          <w:b w:val="0"/>
+          <w:i w:val="0"/>
+          <w:sz w:val="22"/>
+        </w:rPr>
+        <w:t>{%p endif %}</w:t>
+      </w:r>
+    </w:p>
+    <w:p>
+      <w:pPr>
+        <w:spacing w:before="0" w:after="40"/>
+      </w:pPr>
+      <w:r>
+        <w:rPr>
+          <w:rFonts w:ascii="Calibri" w:hAnsi="Calibri"/>
+          <w:b w:val="0"/>
+          <w:i w:val="0"/>
+          <w:sz w:val="22"/>
+        </w:rPr>
+        <w:t>{%p for x in adv_sub1_items %}</w:t>
+      </w:r>
+    </w:p>
+    <w:p>
+      <w:pPr>
+        <w:spacing w:before="0" w:after="40"/>
+      </w:pPr>
+      <w:r>
+        <w:rPr>
+          <w:rFonts w:ascii="Calibri" w:hAnsi="Calibri"/>
+          <w:b w:val="0"/>
+          <w:i w:val="0"/>
+          <w:sz w:val="22"/>
+        </w:rPr>
+        <w:t>-  {{ x.item }}</w:t>
+      </w:r>
+    </w:p>
+    <w:p>
+      <w:pPr>
+        <w:spacing w:before="0" w:after="40"/>
+      </w:pPr>
+      <w:r>
+        <w:rPr>
+          <w:rFonts w:ascii="Calibri" w:hAnsi="Calibri"/>
+          <w:b w:val="0"/>
+          <w:i w:val="0"/>
+          <w:sz w:val="22"/>
+        </w:rPr>
+        <w:t>{%p endfor %}</w:t>
+      </w:r>
+    </w:p>
+    <w:p>
+      <w:pPr>
+        <w:spacing w:before="0" w:after="40"/>
+      </w:pPr>
+      <w:r>
+        <w:rPr>
+          <w:rFonts w:ascii="Calibri" w:hAnsi="Calibri"/>
+          <w:b w:val="0"/>
+          <w:i w:val="0"/>
+          <w:sz w:val="22"/>
+        </w:rPr>
+        <w:t>{%p if adv_sub2_title %}</w:t>
+      </w:r>
+    </w:p>
+    <w:p>
+      <w:pPr>
+        <w:spacing w:before="200" w:after="40"/>
+      </w:pPr>
+      <w:r>
+        <w:rPr>
+          <w:rFonts w:ascii="Calibri" w:hAnsi="Calibri"/>
+          <w:b/>
+          <w:i w:val="0"/>
+          <w:sz w:val="22"/>
+        </w:rPr>
+        <w:t>{{ adv_sub2_title }}</w:t>
+      </w:r>
+    </w:p>
+    <w:p>
+      <w:pPr>
+        <w:spacing w:before="0" w:after="40"/>
+      </w:pPr>
+      <w:r>
+        <w:rPr>
+          <w:rFonts w:ascii="Calibri" w:hAnsi="Calibri"/>
+          <w:b w:val="0"/>
+          <w:i w:val="0"/>
+          <w:sz w:val="22"/>
+        </w:rPr>
+        <w:t>{%p endif %}</w:t>
+      </w:r>
+    </w:p>
+    <w:p>
+      <w:pPr>
+        <w:spacing w:before="0" w:after="40"/>
+      </w:pPr>
+      <w:r>
+        <w:rPr>
+          <w:rFonts w:ascii="Calibri" w:hAnsi="Calibri"/>
+          <w:b w:val="0"/>
+          <w:i w:val="0"/>
+          <w:sz w:val="22"/>
+        </w:rPr>
+        <w:t>{%p for x in adv_sub2_items %}</w:t>
+      </w:r>
+    </w:p>
+    <w:p>
+      <w:pPr>
+        <w:spacing w:before="0" w:after="40"/>
+      </w:pPr>
+      <w:r>
+        <w:rPr>
+          <w:rFonts w:ascii="Calibri" w:hAnsi="Calibri"/>
+          <w:b w:val="0"/>
+          <w:i w:val="0"/>
+          <w:sz w:val="22"/>
+        </w:rPr>
+        <w:t>-  {{ x.item }}</w:t>
+      </w:r>
+    </w:p>
+    <w:p>
+      <w:pPr>
+        <w:spacing w:before="0" w:after="40"/>
+      </w:pPr>
+      <w:r>
+        <w:rPr>
+          <w:rFonts w:ascii="Calibri" w:hAnsi="Calibri"/>
+          <w:b w:val="0"/>
+          <w:i w:val="0"/>
+          <w:sz w:val="22"/>
+        </w:rPr>
+        <w:t>{%p endfor %}</w:t>
+      </w:r>
+    </w:p>
+    <w:p>
+      <w:pPr>
+        <w:spacing w:before="0" w:after="40"/>
+      </w:pPr>
+      <w:r>
+        <w:rPr>
+          <w:rFonts w:ascii="Calibri" w:hAnsi="Calibri"/>
+          <w:b w:val="0"/>
+          <w:i w:val="0"/>
+          <w:sz w:val="22"/>
+        </w:rPr>
+      </w:r>
+    </w:p>
+    <w:p>
+      <w:pPr>
+        <w:spacing w:before="0" w:after="40"/>
+      </w:pPr>
+      <w:r>
+        <w:rPr>
+          <w:rFonts w:ascii="Calibri" w:hAnsi="Calibri"/>
+          <w:b w:val="0"/>
+          <w:i w:val="0"/>
+          <w:sz w:val="22"/>
+        </w:rPr>
+        <w:t>{%p for x in adv_closing %}</w:t>
+      </w:r>
+    </w:p>
+    <w:p>
+      <w:pPr>
+        <w:spacing w:before="160" w:after="40"/>
+      </w:pPr>
+      <w:r>
+        <w:rPr>
+          <w:rFonts w:ascii="Calibri" w:hAnsi="Calibri"/>
+          <w:b/>
+          <w:i/>
+          <w:sz w:val="22"/>
+        </w:rPr>
+        <w:t>{{ x.item }}</w:t>
+      </w:r>
+    </w:p>
+    <w:p>
+      <w:pPr>
+        <w:spacing w:before="0" w:after="40"/>
+      </w:pPr>
+      <w:r>
+        <w:rPr>
+          <w:rFonts w:ascii="Calibri" w:hAnsi="Calibri"/>
+          <w:b w:val="0"/>
+          <w:i w:val="0"/>
+          <w:sz w:val="22"/>
+        </w:rPr>
+        <w:t>{%p endfor %}</w:t>
+      </w:r>
+    </w:p>
     <w:sectPr>
       <w:headerReference w:type="default" r:id="rId9"/>
       <w:footerReference w:type="default" r:id="rId10"/>

</xml_diff>

<commit_message>
style: advantages heading to 16pt to match section-heading scale
The Advantages heading was 14pt/unstyled while every native section heading is
16pt; bump it to 16pt (keeping bold + red) with consistent spacing across the
four equipment templates.

Co-Authored-By: Claude Opus 4.8 <noreply@anthropic.com>
</commit_message>
<xml_diff>
--- a/Blower_Offer_Template.docx
+++ b/Blower_Offer_Template.docx
@@ -4192,7 +4192,7 @@
     </w:p>
     <w:p>
       <w:pPr>
-        <w:spacing w:before="0" w:after="40"/>
+        <w:spacing w:before="120" w:after="160"/>
       </w:pPr>
       <w:r>
         <w:rPr>
@@ -4200,7 +4200,7 @@
           <w:b/>
           <w:i w:val="0"/>
           <w:color w:val="C00000"/>
-          <w:sz w:val="28"/>
+          <w:sz w:val="32"/>
         </w:rPr>
         <w:t>{{ adv_title }}</w:t>
       </w:r>

</xml_diff>

<commit_message>
feat: equipment offer UI revamp + High Velocity burner + per-type advantages
UI revamp (all four equipment templates + generators):
- Remove the 2-page Company Profile section; renumber sections; fix the
  Table of Contents (drop Company Profile + phantom General Information).
- Specifications table: proper single borders (was borderless).
- Whole-rupee prices in the price schedule (drop the .XX paise).
- Standard ENCON T&C defaults so the T&C annexure is never blank.
- Drop the Marketing Person Details table when it has no data.

Burner changes:
- Replace the GAIL Gas Burner option with ENCON High Velocity Burner, pulled
  from burner_pricelist_master ("HIGH VELOCITY OIL BURNERS"); scope wording +
  components for the hv type.
- Dynamic per-fuel-type Advantages: Gas / Dual Fuel / High Velocity / Film,
  selected via specs['advantages_kind'] (burner) and gated for HPU/PU.

Co-Authored-By: Claude Opus 4.8 <noreply@anthropic.com>
</commit_message>
<xml_diff>
--- a/Blower_Offer_Template.docx
+++ b/Blower_Offer_Template.docx
@@ -1036,7 +1036,7 @@
               <w:bottom w:val="single" w:color="BFBFBF" w:sz="4"/>
               <w:right w:val="single" w:color="BFBFBF" w:sz="4"/>
             </w:tcBorders>
-            <w:shd w:fill="F3F4F6" w:val="clear"/>
+            <w:shd w:fill="FFFFFF" w:val="clear"/>
             <w:tcMar>
               <w:top w:type="dxa" w:w="100"/>
               <w:left w:type="dxa" w:w="140"/>
@@ -1056,7 +1056,7 @@
                 <w:sz w:val="22"/>
                 <w:szCs w:val="22"/>
               </w:rPr>
-              <w:t xml:space="preserve">1</w:t>
+              <w:t>1</w:t>
             </w:r>
           </w:p>
         </w:tc>
@@ -1069,7 +1069,7 @@
               <w:bottom w:val="single" w:color="BFBFBF" w:sz="4"/>
               <w:right w:val="single" w:color="BFBFBF" w:sz="4"/>
             </w:tcBorders>
-            <w:shd w:fill="F3F4F6" w:val="clear"/>
+            <w:shd w:fill="FFFFFF" w:val="clear"/>
             <w:tcMar>
               <w:top w:type="dxa" w:w="100"/>
               <w:left w:type="dxa" w:w="140"/>
@@ -1089,7 +1089,7 @@
                 <w:sz w:val="22"/>
                 <w:szCs w:val="22"/>
               </w:rPr>
-              <w:t xml:space="preserve">Company Profile</w:t>
+              <w:t xml:space="preserve">About the Client</w:t>
             </w:r>
           </w:p>
         </w:tc>
@@ -1104,7 +1104,7 @@
               <w:bottom w:val="single" w:color="BFBFBF" w:sz="4"/>
               <w:right w:val="single" w:color="BFBFBF" w:sz="4"/>
             </w:tcBorders>
-            <w:shd w:fill="FFFFFF" w:val="clear"/>
+            <w:shd w:fill="F3F4F6" w:val="clear"/>
             <w:tcMar>
               <w:top w:type="dxa" w:w="100"/>
               <w:left w:type="dxa" w:w="140"/>
@@ -1124,7 +1124,7 @@
                 <w:sz w:val="22"/>
                 <w:szCs w:val="22"/>
               </w:rPr>
-              <w:t xml:space="preserve">2</w:t>
+              <w:t>2</w:t>
             </w:r>
           </w:p>
         </w:tc>
@@ -1137,7 +1137,7 @@
               <w:bottom w:val="single" w:color="BFBFBF" w:sz="4"/>
               <w:right w:val="single" w:color="BFBFBF" w:sz="4"/>
             </w:tcBorders>
-            <w:shd w:fill="FFFFFF" w:val="clear"/>
+            <w:shd w:fill="F3F4F6" w:val="clear"/>
             <w:tcMar>
               <w:top w:type="dxa" w:w="100"/>
               <w:left w:type="dxa" w:w="140"/>
@@ -1157,143 +1157,7 @@
                 <w:sz w:val="22"/>
                 <w:szCs w:val="22"/>
               </w:rPr>
-              <w:t xml:space="preserve">About the Client</w:t>
-            </w:r>
-          </w:p>
-        </w:tc>
-      </w:tr>
-      <w:tr>
-        <w:tc>
-          <w:tcPr>
-            <w:tcW w:type="dxa" w:w="1200"/>
-            <w:tcBorders>
-              <w:top w:val="single" w:color="BFBFBF" w:sz="4"/>
-              <w:left w:val="single" w:color="BFBFBF" w:sz="4"/>
-              <w:bottom w:val="single" w:color="BFBFBF" w:sz="4"/>
-              <w:right w:val="single" w:color="BFBFBF" w:sz="4"/>
-            </w:tcBorders>
-            <w:shd w:fill="F3F4F6" w:val="clear"/>
-            <w:tcMar>
-              <w:top w:type="dxa" w:w="100"/>
-              <w:left w:type="dxa" w:w="140"/>
-              <w:bottom w:type="dxa" w:w="100"/>
-              <w:right w:type="dxa" w:w="140"/>
-            </w:tcMar>
-            <w:vAlign w:val="center"/>
-          </w:tcPr>
-          <w:p>
-            <w:pPr>
-              <w:spacing w:after="40" w:before="40"/>
-              <w:jc w:val="center"/>
-            </w:pPr>
-            <w:r>
-              <w:rPr>
-                <w:rFonts w:ascii="Calibri" w:cs="Calibri" w:eastAsia="Calibri" w:hAnsi="Calibri"/>
-                <w:sz w:val="22"/>
-                <w:szCs w:val="22"/>
-              </w:rPr>
-              <w:t xml:space="preserve">3</w:t>
-            </w:r>
-          </w:p>
-        </w:tc>
-        <w:tc>
-          <w:tcPr>
-            <w:tcW w:type="dxa" w:w="8160"/>
-            <w:tcBorders>
-              <w:top w:val="single" w:color="BFBFBF" w:sz="4"/>
-              <w:left w:val="single" w:color="BFBFBF" w:sz="4"/>
-              <w:bottom w:val="single" w:color="BFBFBF" w:sz="4"/>
-              <w:right w:val="single" w:color="BFBFBF" w:sz="4"/>
-            </w:tcBorders>
-            <w:shd w:fill="F3F4F6" w:val="clear"/>
-            <w:tcMar>
-              <w:top w:type="dxa" w:w="100"/>
-              <w:left w:type="dxa" w:w="140"/>
-              <w:bottom w:type="dxa" w:w="100"/>
-              <w:right w:type="dxa" w:w="140"/>
-            </w:tcMar>
-            <w:vAlign w:val="center"/>
-          </w:tcPr>
-          <w:p>
-            <w:pPr>
-              <w:spacing w:after="40" w:before="40"/>
-              <w:jc w:val="left"/>
-            </w:pPr>
-            <w:r>
-              <w:rPr>
-                <w:rFonts w:ascii="Calibri" w:cs="Calibri" w:eastAsia="Calibri" w:hAnsi="Calibri"/>
-                <w:sz w:val="22"/>
-                <w:szCs w:val="22"/>
-              </w:rPr>
               <w:t xml:space="preserve">Technical Specifications</w:t>
-            </w:r>
-          </w:p>
-        </w:tc>
-      </w:tr>
-      <w:tr>
-        <w:tc>
-          <w:tcPr>
-            <w:tcW w:type="dxa" w:w="1200"/>
-            <w:tcBorders>
-              <w:top w:val="single" w:color="BFBFBF" w:sz="4"/>
-              <w:left w:val="single" w:color="BFBFBF" w:sz="4"/>
-              <w:bottom w:val="single" w:color="BFBFBF" w:sz="4"/>
-              <w:right w:val="single" w:color="BFBFBF" w:sz="4"/>
-            </w:tcBorders>
-            <w:shd w:fill="FFFFFF" w:val="clear"/>
-            <w:tcMar>
-              <w:top w:type="dxa" w:w="100"/>
-              <w:left w:type="dxa" w:w="140"/>
-              <w:bottom w:type="dxa" w:w="100"/>
-              <w:right w:type="dxa" w:w="140"/>
-            </w:tcMar>
-            <w:vAlign w:val="center"/>
-          </w:tcPr>
-          <w:p>
-            <w:pPr>
-              <w:spacing w:after="40" w:before="40"/>
-              <w:jc w:val="center"/>
-            </w:pPr>
-            <w:r>
-              <w:rPr>
-                <w:rFonts w:ascii="Calibri" w:cs="Calibri" w:eastAsia="Calibri" w:hAnsi="Calibri"/>
-                <w:sz w:val="22"/>
-                <w:szCs w:val="22"/>
-              </w:rPr>
-              <w:t xml:space="preserve">4</w:t>
-            </w:r>
-          </w:p>
-        </w:tc>
-        <w:tc>
-          <w:tcPr>
-            <w:tcW w:type="dxa" w:w="8160"/>
-            <w:tcBorders>
-              <w:top w:val="single" w:color="BFBFBF" w:sz="4"/>
-              <w:left w:val="single" w:color="BFBFBF" w:sz="4"/>
-              <w:bottom w:val="single" w:color="BFBFBF" w:sz="4"/>
-              <w:right w:val="single" w:color="BFBFBF" w:sz="4"/>
-            </w:tcBorders>
-            <w:shd w:fill="FFFFFF" w:val="clear"/>
-            <w:tcMar>
-              <w:top w:type="dxa" w:w="100"/>
-              <w:left w:type="dxa" w:w="140"/>
-              <w:bottom w:type="dxa" w:w="100"/>
-              <w:right w:type="dxa" w:w="140"/>
-            </w:tcMar>
-            <w:vAlign w:val="center"/>
-          </w:tcPr>
-          <w:p>
-            <w:pPr>
-              <w:spacing w:after="40" w:before="40"/>
-              <w:jc w:val="left"/>
-            </w:pPr>
-            <w:r>
-              <w:rPr>
-                <w:rFonts w:ascii="Calibri" w:cs="Calibri" w:eastAsia="Calibri" w:hAnsi="Calibri"/>
-                <w:sz w:val="22"/>
-                <w:szCs w:val="22"/>
-              </w:rPr>
-              <w:t xml:space="preserve">General Information</w:t>
             </w:r>
           </w:p>
         </w:tc>
@@ -1795,312 +1659,7 @@
           <w:sz w:val="32"/>
           <w:szCs w:val="32"/>
         </w:rPr>
-        <w:t>1. COMPANY PROFILE</w:t>
-      </w:r>
-    </w:p>
-    <w:p>
-      <w:pPr>
-        <w:pStyle w:val="Heading2"/>
-        <w:spacing w:after="120" w:before="280"/>
-      </w:pPr>
-      <w:r>
-        <w:rPr>
-          <w:rFonts w:ascii="Calibri" w:cs="Calibri" w:eastAsia="Calibri" w:hAnsi="Calibri"/>
-          <w:b/>
-          <w:bCs/>
-          <w:color w:val="E87722"/>
-          <w:sz w:val="26"/>
-          <w:szCs w:val="26"/>
-        </w:rPr>
-        <w:t>ABOUT US</w:t>
-      </w:r>
-    </w:p>
-    <w:p>
-      <w:pPr>
-        <w:spacing w:after="160" w:before="60" w:line="300"/>
-        <w:jc w:val="left"/>
-      </w:pPr>
-      <w:r>
-        <w:rPr>
-          <w:rFonts w:ascii="Calibri" w:cs="Calibri" w:eastAsia="Calibri" w:hAnsi="Calibri"/>
-        </w:rPr>
-        <w:t xml:space="preserve">Founded during the energy crisis of 1978 in India, ENCON Thermal Engineers Pvt. Ltd. is a pioneer in industrial heating and energy conservation solutions. The name “ENCON” stands for Energy Conservation &amp; Conversion, reflecting the company’s commitment to sustainable energy practices. With over four decades of industry experience, ENCON specializes in providing innovative, reliable, and cost-effective thermal systems and equipment for various industries, including iron and steel, automotive, foundries, aluminum, glass, cement, pharmaceutical, and more.</w:t>
-      </w:r>
-    </w:p>
-    <w:p>
-      <w:pPr>
-        <w:spacing w:after="200" w:before="60" w:line="300"/>
-        <w:jc w:val="left"/>
-      </w:pPr>
-      <w:r>
-        <w:rPr>
-          <w:rFonts w:ascii="Calibri" w:cs="Calibri" w:eastAsia="Calibri" w:hAnsi="Calibri"/>
-        </w:rPr>
-        <w:t xml:space="preserve">We are well known for designing, manufacturing, supplying, and commissioning fuel-efficient heating systems on a turnkey basis.</w:t>
-      </w:r>
-    </w:p>
-    <w:p>
-      <w:pPr>
-        <w:pStyle w:val="Heading2"/>
-        <w:spacing w:after="120" w:before="280"/>
-      </w:pPr>
-      <w:r>
-        <w:rPr>
-          <w:rFonts w:ascii="Calibri" w:cs="Calibri" w:eastAsia="Calibri" w:hAnsi="Calibri"/>
-          <w:b/>
-          <w:bCs/>
-          <w:color w:val="E87722"/>
-          <w:sz w:val="26"/>
-          <w:szCs w:val="26"/>
-        </w:rPr>
-        <w:t>INDUSTRIES WE SERVE</w:t>
-      </w:r>
-    </w:p>
-    <w:p>
-      <w:pPr>
-        <w:spacing w:after="200" w:before="60" w:line="300"/>
-        <w:jc w:val="left"/>
-      </w:pPr>
-      <w:r>
-        <w:rPr>
-          <w:rFonts w:ascii="Calibri" w:cs="Calibri" w:eastAsia="Calibri" w:hAnsi="Calibri"/>
-          <w:i/>
-          <w:iCs/>
-          <w:color w:val="6B7280"/>
-        </w:rPr>
-        <w:t xml:space="preserve">Iron &amp; Steel  •  Automotive  •  Foundries  •  Aluminium  •  Glass  •  Cement  •  Pharmaceutical  •  Heat Treatment</w:t>
-      </w:r>
-    </w:p>
-    <w:p>
-      <w:pPr>
-        <w:pStyle w:val="Heading2"/>
-        <w:spacing w:after="120" w:before="280"/>
-      </w:pPr>
-      <w:r>
-        <w:rPr>
-          <w:rFonts w:ascii="Calibri" w:cs="Calibri" w:eastAsia="Calibri" w:hAnsi="Calibri"/>
-          <w:b/>
-          <w:bCs/>
-          <w:color w:val="E87722"/>
-          <w:sz w:val="26"/>
-          <w:szCs w:val="26"/>
-        </w:rPr>
-        <w:t>SOME OF OUR ESTEEMED CLIENTS</w:t>
-      </w:r>
-    </w:p>
-    <w:p>
-      <w:pPr>
-        <w:spacing w:after="200" w:before="60" w:line="300"/>
-        <w:jc w:val="left"/>
-      </w:pPr>
-      <w:r>
-        <w:rPr>
-          <w:rFonts w:ascii="Calibri" w:cs="Calibri" w:eastAsia="Calibri" w:hAnsi="Calibri"/>
-        </w:rPr>
-        <w:t>ENCON has built lasting partnerships with leading names across the steel, casting, and process industries.</w:t>
-      </w:r>
-    </w:p>
-    <w:p>
-      <w:pPr>
-        <w:pStyle w:val="Heading2"/>
-        <w:spacing w:after="120" w:before="280"/>
-      </w:pPr>
-      <w:r>
-        <w:rPr>
-          <w:rFonts w:ascii="Calibri" w:cs="Calibri" w:eastAsia="Calibri" w:hAnsi="Calibri"/>
-          <w:b/>
-          <w:bCs/>
-          <w:color w:val="E87722"/>
-          <w:sz w:val="26"/>
-          <w:szCs w:val="26"/>
-        </w:rPr>
-        <w:t>RESEARCH &amp; DEVELOPMENT</w:t>
-      </w:r>
-    </w:p>
-    <w:p>
-      <w:pPr>
-        <w:spacing w:after="160" w:before="60" w:line="300"/>
-        <w:jc w:val="left"/>
-      </w:pPr>
-      <w:r>
-        <w:rPr>
-          <w:rFonts w:ascii="Calibri" w:cs="Calibri" w:eastAsia="Calibri" w:hAnsi="Calibri"/>
-        </w:rPr>
-        <w:t xml:space="preserve">At ENCON, our dedicated R&amp;D division plays a crucial role in driving innovation and new developments. Our team of experts is continuously engaged in research to improve existing products and develop new technologies that enhance energy efficiency and performance. This commitment to R&amp;D allows us to offer cutting-edge solutions that meet the evolving needs of our clients.</w:t>
-      </w:r>
-    </w:p>
-    <w:p>
-      <w:pPr>
-        <w:spacing w:after="200" w:before="60" w:line="300"/>
-        <w:jc w:val="left"/>
-      </w:pPr>
-      <w:r>
-        <w:rPr>
-          <w:rFonts w:ascii="Calibri" w:cs="Calibri" w:eastAsia="Calibri" w:hAnsi="Calibri"/>
-        </w:rPr>
-        <w:t xml:space="preserve">Recent developments from our R&amp;D team include advancements in self-recuperative and regenerative burners, which significantly improve thermal efficiency and reduce energy consumption in high-temperature applications. We are also exploring new materials and designs to further enhance the durability and effectiveness of our products.</w:t>
-      </w:r>
-    </w:p>
-    <w:p>
-      <w:pPr>
-        <w:pStyle w:val="Heading2"/>
-        <w:spacing w:after="120" w:before="280"/>
-      </w:pPr>
-      <w:r>
-        <w:rPr>
-          <w:rFonts w:ascii="Calibri" w:cs="Calibri" w:eastAsia="Calibri" w:hAnsi="Calibri"/>
-          <w:b/>
-          <w:bCs/>
-          <w:color w:val="E87722"/>
-          <w:sz w:val="26"/>
-          <w:szCs w:val="26"/>
-        </w:rPr>
-        <w:t>OUR COMMITMENT</w:t>
-      </w:r>
-    </w:p>
-    <w:p>
-      <w:pPr>
-        <w:spacing w:after="160" w:before="60" w:line="300"/>
-        <w:jc w:val="left"/>
-      </w:pPr>
-      <w:r>
-        <w:rPr>
-          <w:rFonts w:ascii="Calibri" w:cs="Calibri" w:eastAsia="Calibri" w:hAnsi="Calibri"/>
-        </w:rPr>
-        <w:t xml:space="preserve">We have been committed to building long-term partnerships with our clients for the last 46 years — providing tailored solutions that meet specific needs and contributing to a sustainable future through energy conservation and innovation. ENCON’s dedication to excellence is reflected in our core values: integrity, quality, customer focus, and continuous improvement.</w:t>
-      </w:r>
-    </w:p>
-    <w:p>
-      <w:pPr>
-        <w:spacing w:after="200" w:before="60" w:line="300"/>
-        <w:jc w:val="left"/>
-      </w:pPr>
-      <w:r>
-        <w:rPr>
-          <w:rFonts w:ascii="Calibri" w:cs="Calibri" w:eastAsia="Calibri" w:hAnsi="Calibri"/>
-        </w:rPr>
-        <w:t xml:space="preserve">As a trusted name in the industry, ENCON has successfully executed numerous projects worldwide, earning a reputation for reliability and technical expertise. Our customer-centric approach ensures that we not only meet but exceed client expectations, offering support and guidance throughout the project lifecycle.</w:t>
-      </w:r>
-    </w:p>
-    <w:p>
-      <w:pPr>
-        <w:pStyle w:val="Heading2"/>
-        <w:spacing w:after="120" w:before="280"/>
-      </w:pPr>
-      <w:r>
-        <w:rPr>
-          <w:rFonts w:ascii="Calibri" w:cs="Calibri" w:eastAsia="Calibri" w:hAnsi="Calibri"/>
-          <w:b/>
-          <w:bCs/>
-          <w:color w:val="E87722"/>
-          <w:sz w:val="26"/>
-          <w:szCs w:val="26"/>
-        </w:rPr>
-        <w:t>ENCON’S GLOBAL PRESENCE</w:t>
-      </w:r>
-    </w:p>
-    <w:p>
-      <w:pPr>
-        <w:spacing w:after="200" w:before="60" w:line="300"/>
-        <w:jc w:val="left"/>
-      </w:pPr>
-      <w:r>
-        <w:rPr>
-          <w:rFonts w:ascii="Calibri" w:cs="Calibri" w:eastAsia="Calibri" w:hAnsi="Calibri"/>
-        </w:rPr>
-        <w:t xml:space="preserve">With installations across India, the Middle East, and South-East Asia, ENCON serves a global customer base — backed by responsive after-sales support and a worldwide network of partners.</w:t>
-      </w:r>
-    </w:p>
-    <ns0:p xmlns:ns0="http://schemas.openxmlformats.org/wordprocessingml/2006/main" xmlns:ns1="http://schemas.microsoft.com/office/word/2010/wordml" xmlns:ns2="http://schemas.openxmlformats.org/drawingml/2006/wordprocessingDrawing" xmlns:ns3="http://schemas.microsoft.com/office/word/2010/wordprocessingDrawing" xmlns:ns4="http://schemas.openxmlformats.org/drawingml/2006/main" xmlns:ns5="http://schemas.openxmlformats.org/drawingml/2006/picture" xmlns:ns6="http://schemas.openxmlformats.org/officeDocument/2006/relationships" ns1:paraId="0B67A015" ns1:textId="77777777" ns0:rsidR="009C3D95" ns0:rsidRDefault="00000000">
-      <ns0:pPr>
-        <ns0:pBdr>
-          <ns0:top ns0:val="nil"/>
-          <ns0:left ns0:val="nil"/>
-          <ns0:bottom ns0:val="nil"/>
-          <ns0:right ns0:val="nil"/>
-          <ns0:between ns0:val="nil"/>
-        </ns0:pBdr>
-        <ns0:spacing ns0:before="163"/>
-        <ns0:jc ns0:val="left"/>
-        <ns0:rPr>
-          <ns0:color ns0:val="000000"/>
-          <ns0:sz ns0:val="20"/>
-          <ns0:szCs ns0:val="20"/>
-        </ns0:rPr>
-        <ns0:sectPr ns0:rsidR="009C3D95">
-          <ns0:footerReference ns0:type="default" ns6:id="rId12"/>
-          <ns0:pgSz ns0:w="11906" ns0:h="16838"/>
-          <ns0:pgMar ns0:top="1440" ns0:right="1083" ns0:bottom="1440" ns0:left="1083" ns0:header="0" ns0:footer="1341" ns0:gutter="0"/>
-          <ns0:cols ns0:space="720"/>
-        </ns0:sectPr>
-      </ns0:pPr>
-      <ns0:r>
-        <ns0:rPr>
-          <ns0:noProof/>
-        </ns0:rPr>
-        <ns0:drawing>
-          <ns2:anchor distT="0" distB="0" distL="0" distR="0" simplePos="0" relativeHeight="251682816" behindDoc="0" locked="0" layoutInCell="1" hidden="0" allowOverlap="1" ns3:anchorId="14434975" ns3:editId="7465BD3B">
-            <ns2:simplePos x="0" y="0"/>
-            <ns2:positionH relativeFrom="column">
-              <ns2:align>left</ns2:align>
-            </ns2:positionH>
-            <ns2:positionV relativeFrom="paragraph">
-              <ns2:posOffset>262890</ns2:posOffset>
-            </ns2:positionV>
-            <ns2:extent cx="6165215" cy="3194050"/>
-            <ns2:effectExtent l="0" t="0" r="0" b="0"/>
-            <ns2:wrapTopAndBottom distT="0" distB="0"/>
-            <ns2:docPr id="909070903" name="image22.jpg"/>
-            <ns2:cNvGraphicFramePr/>
-            <ns4:graphic>
-              <ns4:graphicData uri="http://schemas.openxmlformats.org/drawingml/2006/picture">
-                <ns5:pic>
-                  <ns5:nvPicPr>
-                    <ns5:cNvPr id="0" name="image22.jpg"/>
-                    <ns5:cNvPicPr preferRelativeResize="0"/>
-                  </ns5:nvPicPr>
-                  <ns5:blipFill>
-                    <ns4:blip ns6:embed="rId16"/>
-                    <ns4:srcRect/>
-                    <ns4:stretch>
-                      <ns4:fillRect/>
-                    </ns4:stretch>
-                  </ns5:blipFill>
-                  <ns5:spPr>
-                    <ns4:xfrm>
-                      <ns4:off x="0" y="0"/>
-                      <ns4:ext cx="6165215" cy="3194050"/>
-                    </ns4:xfrm>
-                    <ns4:prstGeom prst="rect">
-                      <ns4:avLst/>
-                    </ns4:prstGeom>
-                    <ns4:ln/>
-                  </ns5:spPr>
-                </ns5:pic>
-              </ns4:graphicData>
-            </ns4:graphic>
-          </ns2:anchor>
-        </ns0:drawing>
-      </ns0:r>
-    </ns0:p>
-    <w:p>
-      <w:pPr>
-        <w:pStyle w:val="Heading1"/>
-        <w:pBdr>
-          <w:bottom w:val="single" w:color="E87722" w:sz="12" w:space="4"/>
-        </w:pBdr>
-        <w:spacing w:after="200" w:before="360"/>
-      </w:pPr>
-      <w:r>
-        <w:rPr>
-          <w:rFonts w:ascii="Calibri" w:cs="Calibri" w:eastAsia="Calibri" w:hAnsi="Calibri"/>
-          <w:b/>
-          <w:bCs/>
-          <w:color w:val="1F2937"/>
-          <w:sz w:val="32"/>
-          <w:szCs w:val="32"/>
-        </w:rPr>
-        <w:t>2. ABOUT THE CLIENT</w:t>
+        <w:t>1. ABOUT THE CLIENT</w:t>
       </w:r>
     </w:p>
     <w:p>
@@ -2713,7 +2272,7 @@
           <w:sz w:val="32"/>
           <w:szCs w:val="32"/>
         </w:rPr>
-        <w:t>3. TECHNICAL SPECIFICATIONS</w:t>
+        <w:t>2. TECHNICAL SPECIFICATIONS</w:t>
       </w:r>
     </w:p>
     <w:p>
@@ -2737,12 +2296,12 @@
       <w:tblPr>
         <w:tblW w:type="dxa" w:w="9360"/>
         <w:tblBorders>
-          <w:top w:val="single" w:color="auto" w:sz="4"/>
-          <w:left w:val="single" w:color="auto" w:sz="4"/>
-          <w:bottom w:val="single" w:color="auto" w:sz="4"/>
-          <w:right w:val="single" w:color="auto" w:sz="4"/>
-          <w:insideH w:val="single" w:color="auto" w:sz="4"/>
-          <w:insideV w:val="single" w:color="auto" w:sz="4"/>
+          <w:top w:val="single" w:sz="4" w:space="0" w:color="BFBFBF"/>
+          <w:left w:val="single" w:sz="4" w:space="0" w:color="BFBFBF"/>
+          <w:bottom w:val="single" w:sz="4" w:space="0" w:color="BFBFBF"/>
+          <w:right w:val="single" w:sz="4" w:space="0" w:color="BFBFBF"/>
+          <w:insideH w:val="single" w:sz="4" w:space="0" w:color="BFBFBF"/>
+          <w:insideV w:val="single" w:sz="4" w:space="0" w:color="BFBFBF"/>
         </w:tblBorders>
       </w:tblPr>
       <w:tblGrid>
@@ -2757,12 +2316,6 @@
           <w:tcPr>
             <w:tcW w:type="dxa" w:w="9360"/>
             <w:gridSpan w:val="2"/>
-            <w:tcBorders>
-              <w:top w:val="single" w:color="BFBFBF" w:sz="4"/>
-              <w:left w:val="single" w:color="BFBFBF" w:sz="4"/>
-              <w:bottom w:val="single" w:color="BFBFBF" w:sz="4"/>
-              <w:right w:val="single" w:color="BFBFBF" w:sz="4"/>
-            </w:tcBorders>
             <w:shd w:fill="E87722" w:val="clear"/>
             <w:tcMar>
               <w:top w:type="dxa" w:w="100"/>
@@ -2771,6 +2324,12 @@
               <w:right w:type="dxa" w:w="140"/>
             </w:tcMar>
             <w:vAlign w:val="center"/>
+            <w:tcBorders>
+              <w:top w:val="single" w:sz="4" w:space="0" w:color="BFBFBF"/>
+              <w:left w:val="single" w:sz="4" w:space="0" w:color="BFBFBF"/>
+              <w:bottom w:val="single" w:sz="4" w:space="0" w:color="BFBFBF"/>
+              <w:right w:val="single" w:sz="4" w:space="0" w:color="BFBFBF"/>
+            </w:tcBorders>
           </w:tcPr>
           <w:p>
             <w:r>
@@ -2793,6 +2352,12 @@
         <w:tc>
           <w:tcPr>
             <w:tcW w:type="dxa" w:w="3744"/>
+            <w:tcBorders>
+              <w:top w:val="single" w:sz="4" w:space="0" w:color="BFBFBF"/>
+              <w:left w:val="single" w:sz="4" w:space="0" w:color="BFBFBF"/>
+              <w:bottom w:val="single" w:sz="4" w:space="0" w:color="BFBFBF"/>
+              <w:right w:val="single" w:sz="4" w:space="0" w:color="BFBFBF"/>
+            </w:tcBorders>
           </w:tcPr>
           <w:p>
             <w:r>
@@ -2803,6 +2368,12 @@
         <w:tc>
           <w:tcPr>
             <w:tcW w:type="dxa" w:w="5616"/>
+            <w:tcBorders>
+              <w:top w:val="single" w:sz="4" w:space="0" w:color="BFBFBF"/>
+              <w:left w:val="single" w:sz="4" w:space="0" w:color="BFBFBF"/>
+              <w:bottom w:val="single" w:sz="4" w:space="0" w:color="BFBFBF"/>
+              <w:right w:val="single" w:sz="4" w:space="0" w:color="BFBFBF"/>
+            </w:tcBorders>
           </w:tcPr>
           <w:p>
             <w:r>
@@ -2815,6 +2386,12 @@
         <w:tc>
           <w:tcPr>
             <w:tcW w:type="dxa" w:w="3744"/>
+            <w:tcBorders>
+              <w:top w:val="single" w:sz="4" w:space="0" w:color="BFBFBF"/>
+              <w:left w:val="single" w:sz="4" w:space="0" w:color="BFBFBF"/>
+              <w:bottom w:val="single" w:sz="4" w:space="0" w:color="BFBFBF"/>
+              <w:right w:val="single" w:sz="4" w:space="0" w:color="BFBFBF"/>
+            </w:tcBorders>
           </w:tcPr>
           <w:p>
             <w:r>
@@ -2825,6 +2402,12 @@
         <w:tc>
           <w:tcPr>
             <w:tcW w:type="dxa" w:w="5616"/>
+            <w:tcBorders>
+              <w:top w:val="single" w:sz="4" w:space="0" w:color="BFBFBF"/>
+              <w:left w:val="single" w:sz="4" w:space="0" w:color="BFBFBF"/>
+              <w:bottom w:val="single" w:sz="4" w:space="0" w:color="BFBFBF"/>
+              <w:right w:val="single" w:sz="4" w:space="0" w:color="BFBFBF"/>
+            </w:tcBorders>
           </w:tcPr>
           <w:p>
             <w:r>
@@ -2837,6 +2420,12 @@
         <w:tc>
           <w:tcPr>
             <w:tcW w:type="dxa" w:w="3744"/>
+            <w:tcBorders>
+              <w:top w:val="single" w:sz="4" w:space="0" w:color="BFBFBF"/>
+              <w:left w:val="single" w:sz="4" w:space="0" w:color="BFBFBF"/>
+              <w:bottom w:val="single" w:sz="4" w:space="0" w:color="BFBFBF"/>
+              <w:right w:val="single" w:sz="4" w:space="0" w:color="BFBFBF"/>
+            </w:tcBorders>
           </w:tcPr>
           <w:p>
             <w:r>
@@ -2847,6 +2436,12 @@
         <w:tc>
           <w:tcPr>
             <w:tcW w:type="dxa" w:w="5616"/>
+            <w:tcBorders>
+              <w:top w:val="single" w:sz="4" w:space="0" w:color="BFBFBF"/>
+              <w:left w:val="single" w:sz="4" w:space="0" w:color="BFBFBF"/>
+              <w:bottom w:val="single" w:sz="4" w:space="0" w:color="BFBFBF"/>
+              <w:right w:val="single" w:sz="4" w:space="0" w:color="BFBFBF"/>
+            </w:tcBorders>
           </w:tcPr>
           <w:p>
             <w:r>
@@ -2859,6 +2454,12 @@
         <w:tc>
           <w:tcPr>
             <w:tcW w:type="dxa" w:w="3744"/>
+            <w:tcBorders>
+              <w:top w:val="single" w:sz="4" w:space="0" w:color="BFBFBF"/>
+              <w:left w:val="single" w:sz="4" w:space="0" w:color="BFBFBF"/>
+              <w:bottom w:val="single" w:sz="4" w:space="0" w:color="BFBFBF"/>
+              <w:right w:val="single" w:sz="4" w:space="0" w:color="BFBFBF"/>
+            </w:tcBorders>
           </w:tcPr>
           <w:p>
             <w:r>
@@ -2869,6 +2470,12 @@
         <w:tc>
           <w:tcPr>
             <w:tcW w:type="dxa" w:w="5616"/>
+            <w:tcBorders>
+              <w:top w:val="single" w:sz="4" w:space="0" w:color="BFBFBF"/>
+              <w:left w:val="single" w:sz="4" w:space="0" w:color="BFBFBF"/>
+              <w:bottom w:val="single" w:sz="4" w:space="0" w:color="BFBFBF"/>
+              <w:right w:val="single" w:sz="4" w:space="0" w:color="BFBFBF"/>
+            </w:tcBorders>
           </w:tcPr>
           <w:p>
             <w:r>
@@ -2881,6 +2488,12 @@
         <w:tc>
           <w:tcPr>
             <w:tcW w:type="dxa" w:w="3744"/>
+            <w:tcBorders>
+              <w:top w:val="single" w:sz="4" w:space="0" w:color="BFBFBF"/>
+              <w:left w:val="single" w:sz="4" w:space="0" w:color="BFBFBF"/>
+              <w:bottom w:val="single" w:sz="4" w:space="0" w:color="BFBFBF"/>
+              <w:right w:val="single" w:sz="4" w:space="0" w:color="BFBFBF"/>
+            </w:tcBorders>
           </w:tcPr>
           <w:p>
             <w:r>
@@ -2891,6 +2504,12 @@
         <w:tc>
           <w:tcPr>
             <w:tcW w:type="dxa" w:w="5616"/>
+            <w:tcBorders>
+              <w:top w:val="single" w:sz="4" w:space="0" w:color="BFBFBF"/>
+              <w:left w:val="single" w:sz="4" w:space="0" w:color="BFBFBF"/>
+              <w:bottom w:val="single" w:sz="4" w:space="0" w:color="BFBFBF"/>
+              <w:right w:val="single" w:sz="4" w:space="0" w:color="BFBFBF"/>
+            </w:tcBorders>
           </w:tcPr>
           <w:p>
             <w:r>
@@ -2903,6 +2522,12 @@
         <w:tc>
           <w:tcPr>
             <w:tcW w:type="dxa" w:w="3744"/>
+            <w:tcBorders>
+              <w:top w:val="single" w:sz="4" w:space="0" w:color="BFBFBF"/>
+              <w:left w:val="single" w:sz="4" w:space="0" w:color="BFBFBF"/>
+              <w:bottom w:val="single" w:sz="4" w:space="0" w:color="BFBFBF"/>
+              <w:right w:val="single" w:sz="4" w:space="0" w:color="BFBFBF"/>
+            </w:tcBorders>
           </w:tcPr>
           <w:p>
             <w:r>
@@ -2913,6 +2538,12 @@
         <w:tc>
           <w:tcPr>
             <w:tcW w:type="dxa" w:w="5616"/>
+            <w:tcBorders>
+              <w:top w:val="single" w:sz="4" w:space="0" w:color="BFBFBF"/>
+              <w:left w:val="single" w:sz="4" w:space="0" w:color="BFBFBF"/>
+              <w:bottom w:val="single" w:sz="4" w:space="0" w:color="BFBFBF"/>
+              <w:right w:val="single" w:sz="4" w:space="0" w:color="BFBFBF"/>
+            </w:tcBorders>
           </w:tcPr>
           <w:p>
             <w:r>

</xml_diff>

<commit_message>
feat: cover letter OUR REF from input + today's date; drop "Kindly note" line
- OUR REF now uses the user's Enquiry / Ref No. input (cust.ref_no), falling
  back to the auto ENCON ref when blank; applies to blower/burner and HPU/PU.
- DATE is always today's date.
- Remove the "Kindly note that our price list is likely to revise shortly…"
  paragraph from the cover letter in all four equipment templates.

Co-Authored-By: Claude Opus 4.8 <noreply@anthropic.com>
</commit_message>
<xml_diff>
--- a/Blower_Offer_Template.docx
+++ b/Blower_Offer_Template.docx
@@ -643,33 +643,6 @@
           <w:u w:val="none"/>
         </w:rPr>
         <w:t>We hope the offer suits your present requirement. Though we have tried to be very elaborate in our offer, should you need any further assistance from our end to enable you to finalize the requirement, please contact us immediately. We would be happy to assist you anytime.</w:t>
-      </w:r>
-    </w:p>
-    <w:p>
-      <w:pPr>
-        <w:jc w:val="left"/>
-      </w:pPr>
-      <w:r>
-        <w:rPr>
-          <w:rFonts w:ascii="Calibri" w:hAnsi="Calibri"/>
-          <w:b w:val="0"/>
-          <w:sz w:val="22"/>
-          <w:u w:val="none"/>
-        </w:rPr>
-      </w:r>
-    </w:p>
-    <w:p>
-      <w:pPr>
-        <w:jc w:val="both"/>
-      </w:pPr>
-      <w:r>
-        <w:rPr>
-          <w:rFonts w:ascii="Calibri" w:hAnsi="Calibri"/>
-          <w:b/>
-          <w:sz w:val="22"/>
-          <w:u w:val="none"/>
-        </w:rPr>
-        <w:t>Kindly note that our price list is likely to revise shortly. So request you to send us the order asap to enable us to honour the existing prices.</w:t>
       </w:r>
     </w:p>
     <w:p>

</xml_diff>

<commit_message>
feat: dynamic technical-person signature in equipment offer cover letter
Replace the hardcoded "J P Singh (Director – Marketing)" / +91 98250 97240 /
vadodara@encon.co.in signer block with {{ technical_person }} /
{{ technical_phone }} / {{ technical_email }} (filled from the form's Technical
Person fields). ENCON company name, Vadodara office, the award lines, website
and "ENERGY SAVED…" stay as fixed branding. Trimmed the extra blank line after
"With best regards,".

Co-Authored-By: Claude Opus 4.8 <noreply@anthropic.com>
</commit_message>
<xml_diff>
--- a/Blower_Offer_Template.docx
+++ b/Blower_Offer_Template.docx
@@ -723,20 +723,7 @@
           <w:sz w:val="22"/>
           <w:u w:val="none"/>
         </w:rPr>
-      </w:r>
-    </w:p>
-    <w:p>
-      <w:pPr>
-        <w:jc w:val="left"/>
-      </w:pPr>
-      <w:r>
-        <w:rPr>
-          <w:rFonts w:ascii="Calibri" w:hAnsi="Calibri"/>
-          <w:b w:val="0"/>
-          <w:sz w:val="22"/>
-          <w:u w:val="none"/>
-        </w:rPr>
-        <w:t>J P Singh (Director – Marketing)</w:t>
+        <w:t>{{ technical_person }}</w:t>
       </w:r>
     </w:p>
     <w:p>
@@ -808,7 +795,7 @@
           <w:sz w:val="22"/>
           <w:u w:val="none"/>
         </w:rPr>
-        <w:t>Mobile: +91 98250 97240</w:t>
+        <w:t>Mobile: {{ technical_phone }}</w:t>
       </w:r>
     </w:p>
     <w:p>
@@ -832,7 +819,7 @@
           <w:sz w:val="22"/>
           <w:u w:val="single"/>
         </w:rPr>
-        <w:t>vadodara@encon.co.in</w:t>
+        <w:t>{{ technical_email }}</w:t>
       </w:r>
     </w:p>
     <w:p>
@@ -3021,6 +3008,304 @@
       </w:pPr>
     </w:p>
     <w:p>
+      <w:r>
+        <w:br w:type="page"/>
+      </w:r>
+    </w:p>
+    <w:p>
+      <w:pPr>
+        <w:spacing w:before="120" w:after="160"/>
+      </w:pPr>
+      <w:r>
+        <w:rPr>
+          <w:rFonts w:ascii="Calibri" w:hAnsi="Calibri"/>
+          <w:b/>
+          <w:i w:val="0"/>
+          <w:color w:val="C00000"/>
+          <w:sz w:val="32"/>
+        </w:rPr>
+        <w:t>{{ adv_title }}</w:t>
+      </w:r>
+    </w:p>
+    <w:p>
+      <w:pPr>
+        <w:spacing w:before="0" w:after="40"/>
+      </w:pPr>
+      <w:r>
+        <w:rPr>
+          <w:rFonts w:ascii="Calibri" w:hAnsi="Calibri"/>
+          <w:b w:val="0"/>
+          <w:i w:val="0"/>
+          <w:sz w:val="22"/>
+        </w:rPr>
+      </w:r>
+    </w:p>
+    <w:p>
+      <w:pPr>
+        <w:spacing w:before="0" w:after="40"/>
+      </w:pPr>
+      <w:r>
+        <w:rPr>
+          <w:rFonts w:ascii="Calibri" w:hAnsi="Calibri"/>
+          <w:b w:val="0"/>
+          <w:i w:val="0"/>
+          <w:sz w:val="22"/>
+        </w:rPr>
+        <w:t>{%p for x in adv_items %}</w:t>
+      </w:r>
+    </w:p>
+    <w:p>
+      <w:pPr>
+        <w:spacing w:before="0" w:after="40"/>
+      </w:pPr>
+      <w:r>
+        <w:rPr>
+          <w:rFonts w:ascii="Calibri" w:hAnsi="Calibri"/>
+          <w:b w:val="0"/>
+          <w:i w:val="0"/>
+          <w:sz w:val="22"/>
+        </w:rPr>
+        <w:t>-  {{ x.item }}</w:t>
+      </w:r>
+    </w:p>
+    <w:p>
+      <w:pPr>
+        <w:spacing w:before="0" w:after="40"/>
+      </w:pPr>
+      <w:r>
+        <w:rPr>
+          <w:rFonts w:ascii="Calibri" w:hAnsi="Calibri"/>
+          <w:b w:val="0"/>
+          <w:i w:val="0"/>
+          <w:sz w:val="22"/>
+        </w:rPr>
+        <w:t>{%p endfor %}</w:t>
+      </w:r>
+    </w:p>
+    <w:p>
+      <w:pPr>
+        <w:spacing w:before="0" w:after="40"/>
+      </w:pPr>
+      <w:r>
+        <w:rPr>
+          <w:rFonts w:ascii="Calibri" w:hAnsi="Calibri"/>
+          <w:b w:val="0"/>
+          <w:i w:val="0"/>
+          <w:sz w:val="22"/>
+        </w:rPr>
+        <w:t>{%p if adv_sub1_title %}</w:t>
+      </w:r>
+    </w:p>
+    <w:p>
+      <w:pPr>
+        <w:spacing w:before="200" w:after="40"/>
+      </w:pPr>
+      <w:r>
+        <w:rPr>
+          <w:rFonts w:ascii="Calibri" w:hAnsi="Calibri"/>
+          <w:b/>
+          <w:i w:val="0"/>
+          <w:sz w:val="22"/>
+        </w:rPr>
+        <w:t>{{ adv_sub1_title }}</w:t>
+      </w:r>
+    </w:p>
+    <w:p>
+      <w:pPr>
+        <w:spacing w:before="0" w:after="40"/>
+      </w:pPr>
+      <w:r>
+        <w:rPr>
+          <w:rFonts w:ascii="Calibri" w:hAnsi="Calibri"/>
+          <w:b w:val="0"/>
+          <w:i w:val="0"/>
+          <w:sz w:val="22"/>
+        </w:rPr>
+        <w:t>{%p endif %}</w:t>
+      </w:r>
+    </w:p>
+    <w:p>
+      <w:pPr>
+        <w:spacing w:before="0" w:after="40"/>
+      </w:pPr>
+      <w:r>
+        <w:rPr>
+          <w:rFonts w:ascii="Calibri" w:hAnsi="Calibri"/>
+          <w:b w:val="0"/>
+          <w:i w:val="0"/>
+          <w:sz w:val="22"/>
+        </w:rPr>
+        <w:t>{%p for x in adv_sub1_items %}</w:t>
+      </w:r>
+    </w:p>
+    <w:p>
+      <w:pPr>
+        <w:spacing w:before="0" w:after="40"/>
+      </w:pPr>
+      <w:r>
+        <w:rPr>
+          <w:rFonts w:ascii="Calibri" w:hAnsi="Calibri"/>
+          <w:b w:val="0"/>
+          <w:i w:val="0"/>
+          <w:sz w:val="22"/>
+        </w:rPr>
+        <w:t>-  {{ x.item }}</w:t>
+      </w:r>
+    </w:p>
+    <w:p>
+      <w:pPr>
+        <w:spacing w:before="0" w:after="40"/>
+      </w:pPr>
+      <w:r>
+        <w:rPr>
+          <w:rFonts w:ascii="Calibri" w:hAnsi="Calibri"/>
+          <w:b w:val="0"/>
+          <w:i w:val="0"/>
+          <w:sz w:val="22"/>
+        </w:rPr>
+        <w:t>{%p endfor %}</w:t>
+      </w:r>
+    </w:p>
+    <w:p>
+      <w:pPr>
+        <w:spacing w:before="0" w:after="40"/>
+      </w:pPr>
+      <w:r>
+        <w:rPr>
+          <w:rFonts w:ascii="Calibri" w:hAnsi="Calibri"/>
+          <w:b w:val="0"/>
+          <w:i w:val="0"/>
+          <w:sz w:val="22"/>
+        </w:rPr>
+        <w:t>{%p if adv_sub2_title %}</w:t>
+      </w:r>
+    </w:p>
+    <w:p>
+      <w:pPr>
+        <w:spacing w:before="200" w:after="40"/>
+      </w:pPr>
+      <w:r>
+        <w:rPr>
+          <w:rFonts w:ascii="Calibri" w:hAnsi="Calibri"/>
+          <w:b/>
+          <w:i w:val="0"/>
+          <w:sz w:val="22"/>
+        </w:rPr>
+        <w:t>{{ adv_sub2_title }}</w:t>
+      </w:r>
+    </w:p>
+    <w:p>
+      <w:pPr>
+        <w:spacing w:before="0" w:after="40"/>
+      </w:pPr>
+      <w:r>
+        <w:rPr>
+          <w:rFonts w:ascii="Calibri" w:hAnsi="Calibri"/>
+          <w:b w:val="0"/>
+          <w:i w:val="0"/>
+          <w:sz w:val="22"/>
+        </w:rPr>
+        <w:t>{%p endif %}</w:t>
+      </w:r>
+    </w:p>
+    <w:p>
+      <w:pPr>
+        <w:spacing w:before="0" w:after="40"/>
+      </w:pPr>
+      <w:r>
+        <w:rPr>
+          <w:rFonts w:ascii="Calibri" w:hAnsi="Calibri"/>
+          <w:b w:val="0"/>
+          <w:i w:val="0"/>
+          <w:sz w:val="22"/>
+        </w:rPr>
+        <w:t>{%p for x in adv_sub2_items %}</w:t>
+      </w:r>
+    </w:p>
+    <w:p>
+      <w:pPr>
+        <w:spacing w:before="0" w:after="40"/>
+      </w:pPr>
+      <w:r>
+        <w:rPr>
+          <w:rFonts w:ascii="Calibri" w:hAnsi="Calibri"/>
+          <w:b w:val="0"/>
+          <w:i w:val="0"/>
+          <w:sz w:val="22"/>
+        </w:rPr>
+        <w:t>-  {{ x.item }}</w:t>
+      </w:r>
+    </w:p>
+    <w:p>
+      <w:pPr>
+        <w:spacing w:before="0" w:after="40"/>
+      </w:pPr>
+      <w:r>
+        <w:rPr>
+          <w:rFonts w:ascii="Calibri" w:hAnsi="Calibri"/>
+          <w:b w:val="0"/>
+          <w:i w:val="0"/>
+          <w:sz w:val="22"/>
+        </w:rPr>
+        <w:t>{%p endfor %}</w:t>
+      </w:r>
+    </w:p>
+    <w:p>
+      <w:pPr>
+        <w:spacing w:before="0" w:after="40"/>
+      </w:pPr>
+      <w:r>
+        <w:rPr>
+          <w:rFonts w:ascii="Calibri" w:hAnsi="Calibri"/>
+          <w:b w:val="0"/>
+          <w:i w:val="0"/>
+          <w:sz w:val="22"/>
+        </w:rPr>
+      </w:r>
+    </w:p>
+    <w:p>
+      <w:pPr>
+        <w:spacing w:before="0" w:after="40"/>
+      </w:pPr>
+      <w:r>
+        <w:rPr>
+          <w:rFonts w:ascii="Calibri" w:hAnsi="Calibri"/>
+          <w:b w:val="0"/>
+          <w:i w:val="0"/>
+          <w:sz w:val="22"/>
+        </w:rPr>
+        <w:t>{%p for x in adv_closing %}</w:t>
+      </w:r>
+    </w:p>
+    <w:p>
+      <w:pPr>
+        <w:spacing w:before="160" w:after="40"/>
+      </w:pPr>
+      <w:r>
+        <w:rPr>
+          <w:rFonts w:ascii="Calibri" w:hAnsi="Calibri"/>
+          <w:b/>
+          <w:i/>
+          <w:sz w:val="22"/>
+        </w:rPr>
+        <w:t>{{ x.item }}</w:t>
+      </w:r>
+    </w:p>
+    <w:p>
+      <w:pPr>
+        <w:spacing w:before="0" w:after="40"/>
+      </w:pPr>
+      <w:r>
+        <w:rPr>
+          <w:rFonts w:ascii="Calibri" w:hAnsi="Calibri"/>
+          <w:b w:val="0"/>
+          <w:i w:val="0"/>
+          <w:sz w:val="22"/>
+        </w:rPr>
+        <w:t>{%p endfor %}</w:t>
+      </w:r>
+    </w:p>
+    <w:p>
       <w:pPr>
         <w:pStyle w:val="Heading1"/>
         <w:pBdr>
@@ -3789,304 +4074,6 @@
         </w:tc>
       </w:tr>
     </w:tbl>
-    <w:p>
-      <w:r>
-        <w:br w:type="page"/>
-      </w:r>
-    </w:p>
-    <w:p>
-      <w:pPr>
-        <w:spacing w:before="120" w:after="160"/>
-      </w:pPr>
-      <w:r>
-        <w:rPr>
-          <w:rFonts w:ascii="Calibri" w:hAnsi="Calibri"/>
-          <w:b/>
-          <w:i w:val="0"/>
-          <w:color w:val="C00000"/>
-          <w:sz w:val="32"/>
-        </w:rPr>
-        <w:t>{{ adv_title }}</w:t>
-      </w:r>
-    </w:p>
-    <w:p>
-      <w:pPr>
-        <w:spacing w:before="0" w:after="40"/>
-      </w:pPr>
-      <w:r>
-        <w:rPr>
-          <w:rFonts w:ascii="Calibri" w:hAnsi="Calibri"/>
-          <w:b w:val="0"/>
-          <w:i w:val="0"/>
-          <w:sz w:val="22"/>
-        </w:rPr>
-      </w:r>
-    </w:p>
-    <w:p>
-      <w:pPr>
-        <w:spacing w:before="0" w:after="40"/>
-      </w:pPr>
-      <w:r>
-        <w:rPr>
-          <w:rFonts w:ascii="Calibri" w:hAnsi="Calibri"/>
-          <w:b w:val="0"/>
-          <w:i w:val="0"/>
-          <w:sz w:val="22"/>
-        </w:rPr>
-        <w:t>{%p for x in adv_items %}</w:t>
-      </w:r>
-    </w:p>
-    <w:p>
-      <w:pPr>
-        <w:spacing w:before="0" w:after="40"/>
-      </w:pPr>
-      <w:r>
-        <w:rPr>
-          <w:rFonts w:ascii="Calibri" w:hAnsi="Calibri"/>
-          <w:b w:val="0"/>
-          <w:i w:val="0"/>
-          <w:sz w:val="22"/>
-        </w:rPr>
-        <w:t>-  {{ x.item }}</w:t>
-      </w:r>
-    </w:p>
-    <w:p>
-      <w:pPr>
-        <w:spacing w:before="0" w:after="40"/>
-      </w:pPr>
-      <w:r>
-        <w:rPr>
-          <w:rFonts w:ascii="Calibri" w:hAnsi="Calibri"/>
-          <w:b w:val="0"/>
-          <w:i w:val="0"/>
-          <w:sz w:val="22"/>
-        </w:rPr>
-        <w:t>{%p endfor %}</w:t>
-      </w:r>
-    </w:p>
-    <w:p>
-      <w:pPr>
-        <w:spacing w:before="0" w:after="40"/>
-      </w:pPr>
-      <w:r>
-        <w:rPr>
-          <w:rFonts w:ascii="Calibri" w:hAnsi="Calibri"/>
-          <w:b w:val="0"/>
-          <w:i w:val="0"/>
-          <w:sz w:val="22"/>
-        </w:rPr>
-        <w:t>{%p if adv_sub1_title %}</w:t>
-      </w:r>
-    </w:p>
-    <w:p>
-      <w:pPr>
-        <w:spacing w:before="200" w:after="40"/>
-      </w:pPr>
-      <w:r>
-        <w:rPr>
-          <w:rFonts w:ascii="Calibri" w:hAnsi="Calibri"/>
-          <w:b/>
-          <w:i w:val="0"/>
-          <w:sz w:val="22"/>
-        </w:rPr>
-        <w:t>{{ adv_sub1_title }}</w:t>
-      </w:r>
-    </w:p>
-    <w:p>
-      <w:pPr>
-        <w:spacing w:before="0" w:after="40"/>
-      </w:pPr>
-      <w:r>
-        <w:rPr>
-          <w:rFonts w:ascii="Calibri" w:hAnsi="Calibri"/>
-          <w:b w:val="0"/>
-          <w:i w:val="0"/>
-          <w:sz w:val="22"/>
-        </w:rPr>
-        <w:t>{%p endif %}</w:t>
-      </w:r>
-    </w:p>
-    <w:p>
-      <w:pPr>
-        <w:spacing w:before="0" w:after="40"/>
-      </w:pPr>
-      <w:r>
-        <w:rPr>
-          <w:rFonts w:ascii="Calibri" w:hAnsi="Calibri"/>
-          <w:b w:val="0"/>
-          <w:i w:val="0"/>
-          <w:sz w:val="22"/>
-        </w:rPr>
-        <w:t>{%p for x in adv_sub1_items %}</w:t>
-      </w:r>
-    </w:p>
-    <w:p>
-      <w:pPr>
-        <w:spacing w:before="0" w:after="40"/>
-      </w:pPr>
-      <w:r>
-        <w:rPr>
-          <w:rFonts w:ascii="Calibri" w:hAnsi="Calibri"/>
-          <w:b w:val="0"/>
-          <w:i w:val="0"/>
-          <w:sz w:val="22"/>
-        </w:rPr>
-        <w:t>-  {{ x.item }}</w:t>
-      </w:r>
-    </w:p>
-    <w:p>
-      <w:pPr>
-        <w:spacing w:before="0" w:after="40"/>
-      </w:pPr>
-      <w:r>
-        <w:rPr>
-          <w:rFonts w:ascii="Calibri" w:hAnsi="Calibri"/>
-          <w:b w:val="0"/>
-          <w:i w:val="0"/>
-          <w:sz w:val="22"/>
-        </w:rPr>
-        <w:t>{%p endfor %}</w:t>
-      </w:r>
-    </w:p>
-    <w:p>
-      <w:pPr>
-        <w:spacing w:before="0" w:after="40"/>
-      </w:pPr>
-      <w:r>
-        <w:rPr>
-          <w:rFonts w:ascii="Calibri" w:hAnsi="Calibri"/>
-          <w:b w:val="0"/>
-          <w:i w:val="0"/>
-          <w:sz w:val="22"/>
-        </w:rPr>
-        <w:t>{%p if adv_sub2_title %}</w:t>
-      </w:r>
-    </w:p>
-    <w:p>
-      <w:pPr>
-        <w:spacing w:before="200" w:after="40"/>
-      </w:pPr>
-      <w:r>
-        <w:rPr>
-          <w:rFonts w:ascii="Calibri" w:hAnsi="Calibri"/>
-          <w:b/>
-          <w:i w:val="0"/>
-          <w:sz w:val="22"/>
-        </w:rPr>
-        <w:t>{{ adv_sub2_title }}</w:t>
-      </w:r>
-    </w:p>
-    <w:p>
-      <w:pPr>
-        <w:spacing w:before="0" w:after="40"/>
-      </w:pPr>
-      <w:r>
-        <w:rPr>
-          <w:rFonts w:ascii="Calibri" w:hAnsi="Calibri"/>
-          <w:b w:val="0"/>
-          <w:i w:val="0"/>
-          <w:sz w:val="22"/>
-        </w:rPr>
-        <w:t>{%p endif %}</w:t>
-      </w:r>
-    </w:p>
-    <w:p>
-      <w:pPr>
-        <w:spacing w:before="0" w:after="40"/>
-      </w:pPr>
-      <w:r>
-        <w:rPr>
-          <w:rFonts w:ascii="Calibri" w:hAnsi="Calibri"/>
-          <w:b w:val="0"/>
-          <w:i w:val="0"/>
-          <w:sz w:val="22"/>
-        </w:rPr>
-        <w:t>{%p for x in adv_sub2_items %}</w:t>
-      </w:r>
-    </w:p>
-    <w:p>
-      <w:pPr>
-        <w:spacing w:before="0" w:after="40"/>
-      </w:pPr>
-      <w:r>
-        <w:rPr>
-          <w:rFonts w:ascii="Calibri" w:hAnsi="Calibri"/>
-          <w:b w:val="0"/>
-          <w:i w:val="0"/>
-          <w:sz w:val="22"/>
-        </w:rPr>
-        <w:t>-  {{ x.item }}</w:t>
-      </w:r>
-    </w:p>
-    <w:p>
-      <w:pPr>
-        <w:spacing w:before="0" w:after="40"/>
-      </w:pPr>
-      <w:r>
-        <w:rPr>
-          <w:rFonts w:ascii="Calibri" w:hAnsi="Calibri"/>
-          <w:b w:val="0"/>
-          <w:i w:val="0"/>
-          <w:sz w:val="22"/>
-        </w:rPr>
-        <w:t>{%p endfor %}</w:t>
-      </w:r>
-    </w:p>
-    <w:p>
-      <w:pPr>
-        <w:spacing w:before="0" w:after="40"/>
-      </w:pPr>
-      <w:r>
-        <w:rPr>
-          <w:rFonts w:ascii="Calibri" w:hAnsi="Calibri"/>
-          <w:b w:val="0"/>
-          <w:i w:val="0"/>
-          <w:sz w:val="22"/>
-        </w:rPr>
-      </w:r>
-    </w:p>
-    <w:p>
-      <w:pPr>
-        <w:spacing w:before="0" w:after="40"/>
-      </w:pPr>
-      <w:r>
-        <w:rPr>
-          <w:rFonts w:ascii="Calibri" w:hAnsi="Calibri"/>
-          <w:b w:val="0"/>
-          <w:i w:val="0"/>
-          <w:sz w:val="22"/>
-        </w:rPr>
-        <w:t>{%p for x in adv_closing %}</w:t>
-      </w:r>
-    </w:p>
-    <w:p>
-      <w:pPr>
-        <w:spacing w:before="160" w:after="40"/>
-      </w:pPr>
-      <w:r>
-        <w:rPr>
-          <w:rFonts w:ascii="Calibri" w:hAnsi="Calibri"/>
-          <w:b/>
-          <w:i/>
-          <w:sz w:val="22"/>
-        </w:rPr>
-        <w:t>{{ x.item }}</w:t>
-      </w:r>
-    </w:p>
-    <w:p>
-      <w:pPr>
-        <w:spacing w:before="0" w:after="40"/>
-      </w:pPr>
-      <w:r>
-        <w:rPr>
-          <w:rFonts w:ascii="Calibri" w:hAnsi="Calibri"/>
-          <w:b w:val="0"/>
-          <w:i w:val="0"/>
-          <w:sz w:val="22"/>
-        </w:rPr>
-        <w:t>{%p endfor %}</w:t>
-      </w:r>
-    </w:p>
     <w:sectPr>
       <w:headerReference w:type="default" r:id="rId9"/>
       <w:footerReference w:type="default" r:id="rId10"/>

</xml_diff>

<commit_message>
feat: equipment offers match UpdatedEquipmentTemplate
- Scope of Supply: "TWO gear pumps with motors" is now a bullet (removed from
  the intro sentence) for HPU/PU.
- Price-schedule cell: short one-line description only (heading + sentence, no
  component bullets) for HPU/PU and burner — the full scope/bullets live in
  Annexure I, no duplication.
- Advantages section moved back to AFTER Terms & Conditions (flowing, no page
  break) and its bullets switched from "-" to "•".

Co-Authored-By: Claude Opus 4.8 <noreply@anthropic.com>
</commit_message>
<xml_diff>
--- a/Blower_Offer_Template.docx
+++ b/Blower_Offer_Template.docx
@@ -3008,304 +3008,6 @@
       </w:pPr>
     </w:p>
     <w:p>
-      <w:r>
-        <w:br w:type="page"/>
-      </w:r>
-    </w:p>
-    <w:p>
-      <w:pPr>
-        <w:spacing w:before="120" w:after="160"/>
-      </w:pPr>
-      <w:r>
-        <w:rPr>
-          <w:rFonts w:ascii="Calibri" w:hAnsi="Calibri"/>
-          <w:b/>
-          <w:i w:val="0"/>
-          <w:color w:val="C00000"/>
-          <w:sz w:val="32"/>
-        </w:rPr>
-        <w:t>{{ adv_title }}</w:t>
-      </w:r>
-    </w:p>
-    <w:p>
-      <w:pPr>
-        <w:spacing w:before="0" w:after="40"/>
-      </w:pPr>
-      <w:r>
-        <w:rPr>
-          <w:rFonts w:ascii="Calibri" w:hAnsi="Calibri"/>
-          <w:b w:val="0"/>
-          <w:i w:val="0"/>
-          <w:sz w:val="22"/>
-        </w:rPr>
-      </w:r>
-    </w:p>
-    <w:p>
-      <w:pPr>
-        <w:spacing w:before="0" w:after="40"/>
-      </w:pPr>
-      <w:r>
-        <w:rPr>
-          <w:rFonts w:ascii="Calibri" w:hAnsi="Calibri"/>
-          <w:b w:val="0"/>
-          <w:i w:val="0"/>
-          <w:sz w:val="22"/>
-        </w:rPr>
-        <w:t>{%p for x in adv_items %}</w:t>
-      </w:r>
-    </w:p>
-    <w:p>
-      <w:pPr>
-        <w:spacing w:before="0" w:after="40"/>
-      </w:pPr>
-      <w:r>
-        <w:rPr>
-          <w:rFonts w:ascii="Calibri" w:hAnsi="Calibri"/>
-          <w:b w:val="0"/>
-          <w:i w:val="0"/>
-          <w:sz w:val="22"/>
-        </w:rPr>
-        <w:t>-  {{ x.item }}</w:t>
-      </w:r>
-    </w:p>
-    <w:p>
-      <w:pPr>
-        <w:spacing w:before="0" w:after="40"/>
-      </w:pPr>
-      <w:r>
-        <w:rPr>
-          <w:rFonts w:ascii="Calibri" w:hAnsi="Calibri"/>
-          <w:b w:val="0"/>
-          <w:i w:val="0"/>
-          <w:sz w:val="22"/>
-        </w:rPr>
-        <w:t>{%p endfor %}</w:t>
-      </w:r>
-    </w:p>
-    <w:p>
-      <w:pPr>
-        <w:spacing w:before="0" w:after="40"/>
-      </w:pPr>
-      <w:r>
-        <w:rPr>
-          <w:rFonts w:ascii="Calibri" w:hAnsi="Calibri"/>
-          <w:b w:val="0"/>
-          <w:i w:val="0"/>
-          <w:sz w:val="22"/>
-        </w:rPr>
-        <w:t>{%p if adv_sub1_title %}</w:t>
-      </w:r>
-    </w:p>
-    <w:p>
-      <w:pPr>
-        <w:spacing w:before="200" w:after="40"/>
-      </w:pPr>
-      <w:r>
-        <w:rPr>
-          <w:rFonts w:ascii="Calibri" w:hAnsi="Calibri"/>
-          <w:b/>
-          <w:i w:val="0"/>
-          <w:sz w:val="22"/>
-        </w:rPr>
-        <w:t>{{ adv_sub1_title }}</w:t>
-      </w:r>
-    </w:p>
-    <w:p>
-      <w:pPr>
-        <w:spacing w:before="0" w:after="40"/>
-      </w:pPr>
-      <w:r>
-        <w:rPr>
-          <w:rFonts w:ascii="Calibri" w:hAnsi="Calibri"/>
-          <w:b w:val="0"/>
-          <w:i w:val="0"/>
-          <w:sz w:val="22"/>
-        </w:rPr>
-        <w:t>{%p endif %}</w:t>
-      </w:r>
-    </w:p>
-    <w:p>
-      <w:pPr>
-        <w:spacing w:before="0" w:after="40"/>
-      </w:pPr>
-      <w:r>
-        <w:rPr>
-          <w:rFonts w:ascii="Calibri" w:hAnsi="Calibri"/>
-          <w:b w:val="0"/>
-          <w:i w:val="0"/>
-          <w:sz w:val="22"/>
-        </w:rPr>
-        <w:t>{%p for x in adv_sub1_items %}</w:t>
-      </w:r>
-    </w:p>
-    <w:p>
-      <w:pPr>
-        <w:spacing w:before="0" w:after="40"/>
-      </w:pPr>
-      <w:r>
-        <w:rPr>
-          <w:rFonts w:ascii="Calibri" w:hAnsi="Calibri"/>
-          <w:b w:val="0"/>
-          <w:i w:val="0"/>
-          <w:sz w:val="22"/>
-        </w:rPr>
-        <w:t>-  {{ x.item }}</w:t>
-      </w:r>
-    </w:p>
-    <w:p>
-      <w:pPr>
-        <w:spacing w:before="0" w:after="40"/>
-      </w:pPr>
-      <w:r>
-        <w:rPr>
-          <w:rFonts w:ascii="Calibri" w:hAnsi="Calibri"/>
-          <w:b w:val="0"/>
-          <w:i w:val="0"/>
-          <w:sz w:val="22"/>
-        </w:rPr>
-        <w:t>{%p endfor %}</w:t>
-      </w:r>
-    </w:p>
-    <w:p>
-      <w:pPr>
-        <w:spacing w:before="0" w:after="40"/>
-      </w:pPr>
-      <w:r>
-        <w:rPr>
-          <w:rFonts w:ascii="Calibri" w:hAnsi="Calibri"/>
-          <w:b w:val="0"/>
-          <w:i w:val="0"/>
-          <w:sz w:val="22"/>
-        </w:rPr>
-        <w:t>{%p if adv_sub2_title %}</w:t>
-      </w:r>
-    </w:p>
-    <w:p>
-      <w:pPr>
-        <w:spacing w:before="200" w:after="40"/>
-      </w:pPr>
-      <w:r>
-        <w:rPr>
-          <w:rFonts w:ascii="Calibri" w:hAnsi="Calibri"/>
-          <w:b/>
-          <w:i w:val="0"/>
-          <w:sz w:val="22"/>
-        </w:rPr>
-        <w:t>{{ adv_sub2_title }}</w:t>
-      </w:r>
-    </w:p>
-    <w:p>
-      <w:pPr>
-        <w:spacing w:before="0" w:after="40"/>
-      </w:pPr>
-      <w:r>
-        <w:rPr>
-          <w:rFonts w:ascii="Calibri" w:hAnsi="Calibri"/>
-          <w:b w:val="0"/>
-          <w:i w:val="0"/>
-          <w:sz w:val="22"/>
-        </w:rPr>
-        <w:t>{%p endif %}</w:t>
-      </w:r>
-    </w:p>
-    <w:p>
-      <w:pPr>
-        <w:spacing w:before="0" w:after="40"/>
-      </w:pPr>
-      <w:r>
-        <w:rPr>
-          <w:rFonts w:ascii="Calibri" w:hAnsi="Calibri"/>
-          <w:b w:val="0"/>
-          <w:i w:val="0"/>
-          <w:sz w:val="22"/>
-        </w:rPr>
-        <w:t>{%p for x in adv_sub2_items %}</w:t>
-      </w:r>
-    </w:p>
-    <w:p>
-      <w:pPr>
-        <w:spacing w:before="0" w:after="40"/>
-      </w:pPr>
-      <w:r>
-        <w:rPr>
-          <w:rFonts w:ascii="Calibri" w:hAnsi="Calibri"/>
-          <w:b w:val="0"/>
-          <w:i w:val="0"/>
-          <w:sz w:val="22"/>
-        </w:rPr>
-        <w:t>-  {{ x.item }}</w:t>
-      </w:r>
-    </w:p>
-    <w:p>
-      <w:pPr>
-        <w:spacing w:before="0" w:after="40"/>
-      </w:pPr>
-      <w:r>
-        <w:rPr>
-          <w:rFonts w:ascii="Calibri" w:hAnsi="Calibri"/>
-          <w:b w:val="0"/>
-          <w:i w:val="0"/>
-          <w:sz w:val="22"/>
-        </w:rPr>
-        <w:t>{%p endfor %}</w:t>
-      </w:r>
-    </w:p>
-    <w:p>
-      <w:pPr>
-        <w:spacing w:before="0" w:after="40"/>
-      </w:pPr>
-      <w:r>
-        <w:rPr>
-          <w:rFonts w:ascii="Calibri" w:hAnsi="Calibri"/>
-          <w:b w:val="0"/>
-          <w:i w:val="0"/>
-          <w:sz w:val="22"/>
-        </w:rPr>
-      </w:r>
-    </w:p>
-    <w:p>
-      <w:pPr>
-        <w:spacing w:before="0" w:after="40"/>
-      </w:pPr>
-      <w:r>
-        <w:rPr>
-          <w:rFonts w:ascii="Calibri" w:hAnsi="Calibri"/>
-          <w:b w:val="0"/>
-          <w:i w:val="0"/>
-          <w:sz w:val="22"/>
-        </w:rPr>
-        <w:t>{%p for x in adv_closing %}</w:t>
-      </w:r>
-    </w:p>
-    <w:p>
-      <w:pPr>
-        <w:spacing w:before="160" w:after="40"/>
-      </w:pPr>
-      <w:r>
-        <w:rPr>
-          <w:rFonts w:ascii="Calibri" w:hAnsi="Calibri"/>
-          <w:b/>
-          <w:i/>
-          <w:sz w:val="22"/>
-        </w:rPr>
-        <w:t>{{ x.item }}</w:t>
-      </w:r>
-    </w:p>
-    <w:p>
-      <w:pPr>
-        <w:spacing w:before="0" w:after="40"/>
-      </w:pPr>
-      <w:r>
-        <w:rPr>
-          <w:rFonts w:ascii="Calibri" w:hAnsi="Calibri"/>
-          <w:b w:val="0"/>
-          <w:i w:val="0"/>
-          <w:sz w:val="22"/>
-        </w:rPr>
-        <w:t>{%p endfor %}</w:t>
-      </w:r>
-    </w:p>
-    <w:p>
       <w:pPr>
         <w:pStyle w:val="Heading1"/>
         <w:pBdr>
@@ -4074,6 +3776,299 @@
         </w:tc>
       </w:tr>
     </w:tbl>
+    <w:p>
+      <w:pPr>
+        <w:spacing w:before="120" w:after="160"/>
+      </w:pPr>
+      <w:r>
+        <w:rPr>
+          <w:rFonts w:ascii="Calibri" w:hAnsi="Calibri"/>
+          <w:b/>
+          <w:i w:val="0"/>
+          <w:color w:val="C00000"/>
+          <w:sz w:val="32"/>
+        </w:rPr>
+        <w:t>{{ adv_title }}</w:t>
+      </w:r>
+    </w:p>
+    <w:p>
+      <w:pPr>
+        <w:spacing w:before="0" w:after="40"/>
+      </w:pPr>
+      <w:r>
+        <w:rPr>
+          <w:rFonts w:ascii="Calibri" w:hAnsi="Calibri"/>
+          <w:b w:val="0"/>
+          <w:i w:val="0"/>
+          <w:sz w:val="22"/>
+        </w:rPr>
+      </w:r>
+    </w:p>
+    <w:p>
+      <w:pPr>
+        <w:spacing w:before="0" w:after="40"/>
+      </w:pPr>
+      <w:r>
+        <w:rPr>
+          <w:rFonts w:ascii="Calibri" w:hAnsi="Calibri"/>
+          <w:b w:val="0"/>
+          <w:i w:val="0"/>
+          <w:sz w:val="22"/>
+        </w:rPr>
+        <w:t>{%p for x in adv_items %}</w:t>
+      </w:r>
+    </w:p>
+    <w:p>
+      <w:pPr>
+        <w:spacing w:before="0" w:after="40"/>
+      </w:pPr>
+      <w:r>
+        <w:rPr>
+          <w:rFonts w:ascii="Calibri" w:hAnsi="Calibri"/>
+          <w:b w:val="0"/>
+          <w:i w:val="0"/>
+          <w:sz w:val="22"/>
+        </w:rPr>
+        <w:t>•  {{ x.item }}</w:t>
+      </w:r>
+    </w:p>
+    <w:p>
+      <w:pPr>
+        <w:spacing w:before="0" w:after="40"/>
+      </w:pPr>
+      <w:r>
+        <w:rPr>
+          <w:rFonts w:ascii="Calibri" w:hAnsi="Calibri"/>
+          <w:b w:val="0"/>
+          <w:i w:val="0"/>
+          <w:sz w:val="22"/>
+        </w:rPr>
+        <w:t>{%p endfor %}</w:t>
+      </w:r>
+    </w:p>
+    <w:p>
+      <w:pPr>
+        <w:spacing w:before="0" w:after="40"/>
+      </w:pPr>
+      <w:r>
+        <w:rPr>
+          <w:rFonts w:ascii="Calibri" w:hAnsi="Calibri"/>
+          <w:b w:val="0"/>
+          <w:i w:val="0"/>
+          <w:sz w:val="22"/>
+        </w:rPr>
+        <w:t>{%p if adv_sub1_title %}</w:t>
+      </w:r>
+    </w:p>
+    <w:p>
+      <w:pPr>
+        <w:spacing w:before="200" w:after="40"/>
+      </w:pPr>
+      <w:r>
+        <w:rPr>
+          <w:rFonts w:ascii="Calibri" w:hAnsi="Calibri"/>
+          <w:b/>
+          <w:i w:val="0"/>
+          <w:sz w:val="22"/>
+        </w:rPr>
+        <w:t>{{ adv_sub1_title }}</w:t>
+      </w:r>
+    </w:p>
+    <w:p>
+      <w:pPr>
+        <w:spacing w:before="0" w:after="40"/>
+      </w:pPr>
+      <w:r>
+        <w:rPr>
+          <w:rFonts w:ascii="Calibri" w:hAnsi="Calibri"/>
+          <w:b w:val="0"/>
+          <w:i w:val="0"/>
+          <w:sz w:val="22"/>
+        </w:rPr>
+        <w:t>{%p endif %}</w:t>
+      </w:r>
+    </w:p>
+    <w:p>
+      <w:pPr>
+        <w:spacing w:before="0" w:after="40"/>
+      </w:pPr>
+      <w:r>
+        <w:rPr>
+          <w:rFonts w:ascii="Calibri" w:hAnsi="Calibri"/>
+          <w:b w:val="0"/>
+          <w:i w:val="0"/>
+          <w:sz w:val="22"/>
+        </w:rPr>
+        <w:t>{%p for x in adv_sub1_items %}</w:t>
+      </w:r>
+    </w:p>
+    <w:p>
+      <w:pPr>
+        <w:spacing w:before="0" w:after="40"/>
+      </w:pPr>
+      <w:r>
+        <w:rPr>
+          <w:rFonts w:ascii="Calibri" w:hAnsi="Calibri"/>
+          <w:b w:val="0"/>
+          <w:i w:val="0"/>
+          <w:sz w:val="22"/>
+        </w:rPr>
+        <w:t>•  {{ x.item }}</w:t>
+      </w:r>
+    </w:p>
+    <w:p>
+      <w:pPr>
+        <w:spacing w:before="0" w:after="40"/>
+      </w:pPr>
+      <w:r>
+        <w:rPr>
+          <w:rFonts w:ascii="Calibri" w:hAnsi="Calibri"/>
+          <w:b w:val="0"/>
+          <w:i w:val="0"/>
+          <w:sz w:val="22"/>
+        </w:rPr>
+        <w:t>{%p endfor %}</w:t>
+      </w:r>
+    </w:p>
+    <w:p>
+      <w:pPr>
+        <w:spacing w:before="0" w:after="40"/>
+      </w:pPr>
+      <w:r>
+        <w:rPr>
+          <w:rFonts w:ascii="Calibri" w:hAnsi="Calibri"/>
+          <w:b w:val="0"/>
+          <w:i w:val="0"/>
+          <w:sz w:val="22"/>
+        </w:rPr>
+        <w:t>{%p if adv_sub2_title %}</w:t>
+      </w:r>
+    </w:p>
+    <w:p>
+      <w:pPr>
+        <w:spacing w:before="200" w:after="40"/>
+      </w:pPr>
+      <w:r>
+        <w:rPr>
+          <w:rFonts w:ascii="Calibri" w:hAnsi="Calibri"/>
+          <w:b/>
+          <w:i w:val="0"/>
+          <w:sz w:val="22"/>
+        </w:rPr>
+        <w:t>{{ adv_sub2_title }}</w:t>
+      </w:r>
+    </w:p>
+    <w:p>
+      <w:pPr>
+        <w:spacing w:before="0" w:after="40"/>
+      </w:pPr>
+      <w:r>
+        <w:rPr>
+          <w:rFonts w:ascii="Calibri" w:hAnsi="Calibri"/>
+          <w:b w:val="0"/>
+          <w:i w:val="0"/>
+          <w:sz w:val="22"/>
+        </w:rPr>
+        <w:t>{%p endif %}</w:t>
+      </w:r>
+    </w:p>
+    <w:p>
+      <w:pPr>
+        <w:spacing w:before="0" w:after="40"/>
+      </w:pPr>
+      <w:r>
+        <w:rPr>
+          <w:rFonts w:ascii="Calibri" w:hAnsi="Calibri"/>
+          <w:b w:val="0"/>
+          <w:i w:val="0"/>
+          <w:sz w:val="22"/>
+        </w:rPr>
+        <w:t>{%p for x in adv_sub2_items %}</w:t>
+      </w:r>
+    </w:p>
+    <w:p>
+      <w:pPr>
+        <w:spacing w:before="0" w:after="40"/>
+      </w:pPr>
+      <w:r>
+        <w:rPr>
+          <w:rFonts w:ascii="Calibri" w:hAnsi="Calibri"/>
+          <w:b w:val="0"/>
+          <w:i w:val="0"/>
+          <w:sz w:val="22"/>
+        </w:rPr>
+        <w:t>•  {{ x.item }}</w:t>
+      </w:r>
+    </w:p>
+    <w:p>
+      <w:pPr>
+        <w:spacing w:before="0" w:after="40"/>
+      </w:pPr>
+      <w:r>
+        <w:rPr>
+          <w:rFonts w:ascii="Calibri" w:hAnsi="Calibri"/>
+          <w:b w:val="0"/>
+          <w:i w:val="0"/>
+          <w:sz w:val="22"/>
+        </w:rPr>
+        <w:t>{%p endfor %}</w:t>
+      </w:r>
+    </w:p>
+    <w:p>
+      <w:pPr>
+        <w:spacing w:before="0" w:after="40"/>
+      </w:pPr>
+      <w:r>
+        <w:rPr>
+          <w:rFonts w:ascii="Calibri" w:hAnsi="Calibri"/>
+          <w:b w:val="0"/>
+          <w:i w:val="0"/>
+          <w:sz w:val="22"/>
+        </w:rPr>
+      </w:r>
+    </w:p>
+    <w:p>
+      <w:pPr>
+        <w:spacing w:before="0" w:after="40"/>
+      </w:pPr>
+      <w:r>
+        <w:rPr>
+          <w:rFonts w:ascii="Calibri" w:hAnsi="Calibri"/>
+          <w:b w:val="0"/>
+          <w:i w:val="0"/>
+          <w:sz w:val="22"/>
+        </w:rPr>
+        <w:t>{%p for x in adv_closing %}</w:t>
+      </w:r>
+    </w:p>
+    <w:p>
+      <w:pPr>
+        <w:spacing w:before="160" w:after="40"/>
+      </w:pPr>
+      <w:r>
+        <w:rPr>
+          <w:rFonts w:ascii="Calibri" w:hAnsi="Calibri"/>
+          <w:b/>
+          <w:i/>
+          <w:sz w:val="22"/>
+        </w:rPr>
+        <w:t>{{ x.item }}</w:t>
+      </w:r>
+    </w:p>
+    <w:p>
+      <w:pPr>
+        <w:spacing w:before="0" w:after="40"/>
+      </w:pPr>
+      <w:r>
+        <w:rPr>
+          <w:rFonts w:ascii="Calibri" w:hAnsi="Calibri"/>
+          <w:b w:val="0"/>
+          <w:i w:val="0"/>
+          <w:sz w:val="22"/>
+        </w:rPr>
+        <w:t>{%p endfor %}</w:t>
+      </w:r>
+    </w:p>
     <w:sectPr>
       <w:headerReference w:type="default" r:id="rId9"/>
       <w:footerReference w:type="default" r:id="rId10"/>

</xml_diff>

<commit_message>
style: drop ENCON company/office/award lines from equipment offer signature
Remove "ENCON Thermal Engineers (P) Ltd.," / "Vadodara (Gujarat) INDIA" /
"Winner 1st Prize - NATIONAL ENERGY EFFICIENCY INNOVATION AWARD" /
"(Conferred by the President of India)" from the cover-letter signature in all
four equipment templates. Signature now: technical person + mobile + email +
website + "ENERGY SAVED IS MONEY EARNED!!".

Co-Authored-By: Claude Opus 4.8 <noreply@anthropic.com>
</commit_message>
<xml_diff>
--- a/Blower_Offer_Template.docx
+++ b/Blower_Offer_Template.docx
@@ -724,64 +724,6 @@
           <w:u w:val="none"/>
         </w:rPr>
         <w:t>{{ technical_person }}</w:t>
-      </w:r>
-    </w:p>
-    <w:p>
-      <w:pPr>
-        <w:jc w:val="left"/>
-      </w:pPr>
-      <w:r>
-        <w:rPr>
-          <w:rFonts w:ascii="Calibri" w:hAnsi="Calibri"/>
-          <w:b/>
-          <w:sz w:val="22"/>
-          <w:u w:val="none"/>
-        </w:rPr>
-        <w:t>ENCON Thermal Engineers (P) Ltd.,</w:t>
-      </w:r>
-    </w:p>
-    <w:p>
-      <w:pPr>
-        <w:jc w:val="left"/>
-      </w:pPr>
-      <w:r>
-        <w:rPr>
-          <w:rFonts w:ascii="Calibri" w:hAnsi="Calibri"/>
-          <w:b w:val="0"/>
-          <w:sz w:val="22"/>
-          <w:u w:val="none"/>
-        </w:rPr>
-        <w:t>Vadodara (Gujarat) INDIA</w:t>
-      </w:r>
-    </w:p>
-    <w:p>
-      <w:pPr>
-        <w:jc w:val="left"/>
-      </w:pPr>
-      <w:r>
-        <w:rPr>
-          <w:rFonts w:ascii="Calibri" w:hAnsi="Calibri"/>
-          <w:b/>
-          <w:color w:val="C00000"/>
-          <w:sz w:val="22"/>
-          <w:u w:val="none"/>
-        </w:rPr>
-        <w:t>Winner 1st Prize - NATIONAL ENERGY EFFICIENCY INNOVATION AWARD</w:t>
-      </w:r>
-    </w:p>
-    <w:p>
-      <w:pPr>
-        <w:jc w:val="left"/>
-      </w:pPr>
-      <w:r>
-        <w:rPr>
-          <w:rFonts w:ascii="Calibri" w:hAnsi="Calibri"/>
-          <w:b/>
-          <w:color w:val="C00000"/>
-          <w:sz w:val="22"/>
-          <w:u w:val="none"/>
-        </w:rPr>
-        <w:t>(Conferred by the President of India)</w:t>
       </w:r>
     </w:p>
     <w:p>

</xml_diff>

<commit_message>
fix: advantages heading styling + equipment-offer ref tracks city
Templates (all 4 equipment): give the "ADVANTAGES OF …" heading the Heading 1
paragraph format like every other section heading — but with a DARK GREY
(#595959) underline instead of the orange rule, and drop the blank paragraph
after it so the bullets sit tight under the heading.

Forms (HPU / Blower / Burner): the auto reference number now regenerates live
when the City field changes. Persist the real _refDirty flag (true only when
the user actually typed a custom ref) instead of force-setting it whenever any
ref was restored — so an auto ref follows the city, a typed ref is preserved.

Co-Authored-By: Claude Opus 4.8 <noreply@anthropic.com>
</commit_message>
<xml_diff>
--- a/Blower_Offer_Template.docx
+++ b/Blower_Offer_Template.docx
@@ -3720,30 +3720,14 @@
     </w:tbl>
     <w:p>
       <w:pPr>
-        <w:spacing w:before="120" w:after="160"/>
-      </w:pPr>
-      <w:r>
-        <w:rPr>
-          <w:rFonts w:ascii="Calibri" w:hAnsi="Calibri"/>
-          <w:b/>
-          <w:i w:val="0"/>
-          <w:color w:val="1F2937"/>
-          <w:sz w:val="32"/>
-        </w:rPr>
+        <w:pStyle w:val="Heading1"/>
+        <w:pBdr>
+          <w:bottom w:val="single" w:color="595959" w:sz="12" w:space="4"/>
+        </w:pBdr>
+        <w:spacing w:after="200" w:before="360"/>
+      </w:pPr>
+      <w:r>
         <w:t>{{ adv_title }}</w:t>
-      </w:r>
-    </w:p>
-    <w:p>
-      <w:pPr>
-        <w:spacing w:before="0" w:after="40"/>
-      </w:pPr>
-      <w:r>
-        <w:rPr>
-          <w:rFonts w:ascii="Calibri" w:hAnsi="Calibri"/>
-          <w:b w:val="0"/>
-          <w:i w:val="0"/>
-          <w:sz w:val="22"/>
-        </w:rPr>
       </w:r>
     </w:p>
     <w:p>

</xml_diff>

<commit_message>
feat: equipment offers — Sir/Ma'am greeting, drop price-cell body & ENERGY SAVED
- Cover-letter greeting is now "Dear Sir," for Mr. and "Dear Ma'am," otherwise
  (new _greeting() helper + poc_greeting context in HPU/PU, Blower/Burner paths;
  templates use {{ poc_greeting }}).
- Price Schedule cell shows only the bold heading — the "Supply ex-works of 1 no.
  … ltrs/hr." description line is removed, and the trailing colon dropped.
- Removed "ENERGY SAVED IS MONEY EARNED!!" from the signature in all four
  equipment templates.

Co-Authored-By: Claude Opus 4.8 <noreply@anthropic.com>
</commit_message>
<xml_diff>
--- a/Blower_Offer_Template.docx
+++ b/Blower_Offer_Template.docx
@@ -588,7 +588,7 @@
           <w:sz w:val="22"/>
           <w:u w:val="none"/>
         </w:rPr>
-        <w:t>Dear {{poc_name}},</w:t>
+        <w:t>Dear {{ poc_greeting }},</w:t>
       </w:r>
     </w:p>
     <w:p>
@@ -786,20 +786,6 @@
           <w:u w:val="single"/>
         </w:rPr>
         <w:t>www.encon.co.in</w:t>
-      </w:r>
-    </w:p>
-    <w:p>
-      <w:pPr>
-        <w:jc w:val="left"/>
-      </w:pPr>
-      <w:r>
-        <w:rPr>
-          <w:rFonts w:ascii="Calibri" w:hAnsi="Calibri"/>
-          <w:b/>
-          <w:sz w:val="22"/>
-          <w:u w:val="none"/>
-        </w:rPr>
-        <w:t>ENERGY SAVED IS MONEY EARNED!!</w:t>
       </w:r>
     </w:p>
     <w:p>
@@ -2773,15 +2759,6 @@
                 <w:b/>
               </w:rPr>
               <w:t>{{ price_heading }}</w:t>
-            </w:r>
-          </w:p>
-          <w:p>
-            <w:r>
-              <w:rPr>
-                <w:rFonts w:ascii="Calibri" w:hAnsi="Calibri"/>
-                <w:b w:val="0"/>
-              </w:rPr>
-              <w:t>{{ price_body }}</w:t>
             </w:r>
           </w:p>
           <w:p>

</xml_diff>

<commit_message>
feat: show client's email in equipment-offer cover-letter header
Add an "Email: {{ email }}" line right after "Mobile No:" in the cover-letter
address block of all four equipment templates (Blower/Burner/HPU/PU).

Co-Authored-By: Claude Opus 4.8 <noreply@anthropic.com>
</commit_message>
<xml_diff>
--- a/Blower_Offer_Template.docx
+++ b/Blower_Offer_Template.docx
@@ -443,6 +443,20 @@
           <w:u w:val="none"/>
         </w:rPr>
         <w:t>Mobile No: {{mobile_no}}</w:t>
+      </w:r>
+    </w:p>
+    <w:p>
+      <w:pPr>
+        <w:jc w:val="left"/>
+      </w:pPr>
+      <w:r>
+        <w:rPr>
+          <w:rFonts w:ascii="Calibri" w:hAnsi="Calibri"/>
+          <w:b w:val="0"/>
+          <w:sz w:val="22"/>
+          <w:u w:val="none"/>
+        </w:rPr>
+        <w:t>Email: {{ email }}</w:t>
       </w:r>
     </w:p>
     <w:p>

</xml_diff>

<commit_message>
feat: blower/burner price schedule = heading + description paragraph
Per request, the Blower and Burner price-schedule cell now shows the bold
heading (with colon) followed by the descriptive spec paragraph (capacity /
firing rate / motor), instead of heading-only. Re-added the {{ price_body }}
paragraph to both templates and restored the heading colon in
_generate_equipment_offer. No WITHOUT-MOTOR line in any case (already removed).
HPU/PU remain heading-only.

Co-Authored-By: Claude Opus 4.8 <noreply@anthropic.com>
</commit_message>
<xml_diff>
--- a/Blower_Offer_Template.docx
+++ b/Blower_Offer_Template.docx
@@ -2773,6 +2773,15 @@
                 <w:b/>
               </w:rPr>
               <w:t>{{ price_heading }}</w:t>
+            </w:r>
+          </w:p>
+          <w:p>
+            <w:r>
+              <w:rPr>
+                <w:rFonts w:ascii="Calibri" w:hAnsi="Calibri"/>
+                <w:b w:val="0"/>
+              </w:rPr>
+              <w:t>{{ price_body }}</w:t>
             </w:r>
           </w:p>
           <w:p>

</xml_diff>

<commit_message>
style: heading-only price schedule for ALL equipment + drop KIND ATTN underline
- Blower price cell now heading-only too (removed the description paragraph and
  the colon gating); every equipment price schedule shows just the bold heading.
- Remove the underline from the "KIND ATTN" label in all four equipment
  cover-letter templates.

Co-Authored-By: Claude Opus 4.8 <noreply@anthropic.com>
</commit_message>
<xml_diff>
--- a/Blower_Offer_Template.docx
+++ b/Blower_Offer_Template.docx
@@ -481,7 +481,6 @@
           <w:rFonts w:ascii="Calibri" w:hAnsi="Calibri"/>
           <w:b/>
           <w:sz w:val="22"/>
-          <w:u w:val="single"/>
         </w:rPr>
         <w:t>KIND ATTN  : {{poc_name}} ({{poc_designation}})</w:t>
       </w:r>
@@ -2773,15 +2772,6 @@
                 <w:b/>
               </w:rPr>
               <w:t>{{ price_heading }}</w:t>
-            </w:r>
-          </w:p>
-          <w:p>
-            <w:r>
-              <w:rPr>
-                <w:rFonts w:ascii="Calibri" w:hAnsi="Calibri"/>
-                <w:b w:val="0"/>
-              </w:rPr>
-              <w:t>{{ price_body }}</w:t>
             </w:r>
           </w:p>
           <w:p>

</xml_diff>

<commit_message>
feat: add ENCON works address to equipment-offer signature
Add "ENCON Thermal Engineers Pvt. Ltd." and "53 K.M Stone Vill- Baghola,
Tehsil-Palwal" after the signer name in all four equipment templates. Mobile
and Email stay dynamic ({{ technical_phone }} / {{ technical_email }}). Award
photo + award line not added (on hold per request).

Co-Authored-By: Claude Opus 4.8 <noreply@anthropic.com>
</commit_message>
<xml_diff>
--- a/Blower_Offer_Template.docx
+++ b/Blower_Offer_Template.docx
@@ -737,6 +737,34 @@
           <w:u w:val="none"/>
         </w:rPr>
         <w:t>{{ technical_person }}</w:t>
+      </w:r>
+    </w:p>
+    <w:p>
+      <w:pPr>
+        <w:jc w:val="left"/>
+      </w:pPr>
+      <w:r>
+        <w:rPr>
+          <w:rFonts w:ascii="Calibri" w:hAnsi="Calibri"/>
+          <w:b w:val="0"/>
+          <w:sz w:val="22"/>
+          <w:u w:val="none"/>
+        </w:rPr>
+        <w:t>ENCON Thermal Engineers Pvt. Ltd.</w:t>
+      </w:r>
+    </w:p>
+    <w:p>
+      <w:pPr>
+        <w:jc w:val="left"/>
+      </w:pPr>
+      <w:r>
+        <w:rPr>
+          <w:rFonts w:ascii="Calibri" w:hAnsi="Calibri"/>
+          <w:b w:val="0"/>
+          <w:sz w:val="22"/>
+          <w:u w:val="none"/>
+        </w:rPr>
+        <w:t>53 K.M Stone Vill- Baghola, Tehsil-Palwal</w:t>
       </w:r>
     </w:p>
     <w:p>

</xml_diff>

<commit_message>
feat: add NATIONAL ENERGY EFFICIENCY INNOVATION AWARD line + trophy photo
Append the orange award line (Georgia 13.5pt, #B45F04) and the trophy +
certificate photo below the Website line in all four equipment-offer
signatures. Image sourced from the ENCON offer template.

Co-Authored-By: Claude Opus 4.8 <noreply@anthropic.com>
</commit_message>
<xml_diff>
--- a/Blower_Offer_Template.docx
+++ b/Blower_Offer_Template.docx
@@ -827,6 +827,54 @@
           <w:u w:val="single"/>
         </w:rPr>
         <w:t>www.encon.co.in</w:t>
+      </w:r>
+    </w:p>
+    <w:p/>
+    <w:p>
+      <w:r>
+        <w:rPr>
+          <w:rFonts w:ascii="Georgia" w:hAnsi="Georgia"/>
+          <w:b/>
+          <w:color w:val="B45F04"/>
+          <w:sz w:val="27"/>
+        </w:rPr>
+        <w:t>NATIONAL ENERGY EFFICIENCY INNOVATION AWARD</w:t>
+      </w:r>
+    </w:p>
+    <w:p>
+      <w:r>
+        <w:drawing>
+          <wp:inline xmlns:a="http://schemas.openxmlformats.org/drawingml/2006/main" xmlns:pic="http://schemas.openxmlformats.org/drawingml/2006/picture">
+            <wp:extent cx="1800000" cy="1166834"/>
+            <wp:docPr id="1002" name="Picture 1002"/>
+            <wp:cNvGraphicFramePr>
+              <a:graphicFrameLocks noChangeAspect="1"/>
+            </wp:cNvGraphicFramePr>
+            <a:graphic>
+              <a:graphicData uri="http://schemas.openxmlformats.org/drawingml/2006/picture">
+                <pic:pic>
+                  <pic:nvPicPr>
+                    <pic:cNvPr id="0" name="cand3.jpg"/>
+                    <pic:cNvPicPr/>
+                  </pic:nvPicPr>
+                  <pic:blipFill>
+                    <a:blip r:embed="rId14"/>
+                    <a:stretch>
+                      <a:fillRect/>
+                    </a:stretch>
+                  </pic:blipFill>
+                  <pic:spPr>
+                    <a:xfrm>
+                      <a:off x="0" y="0"/>
+                      <a:ext cx="1800000" cy="1166834"/>
+                    </a:xfrm>
+                    <a:prstGeom prst="rect"/>
+                  </pic:spPr>
+                </pic:pic>
+              </a:graphicData>
+            </a:graphic>
+          </wp:inline>
+        </w:drawing>
       </w:r>
     </w:p>
     <w:p>

</xml_diff>

<commit_message>
style: equipment offer letter — drop "COVER LETTER" heading, bold equipment name
In the HPU / PU / Blower / Burner offer templates, remove the redundant
"COVER LETTER" heading and bold the {{equipment_name}} mention in the letter
body ("...requirement of our <equipment>..."). The SUB:{{subject}} line was
already bold. Rendered-tested with docxtpl (placeholder + bold survive).

Co-Authored-By: Claude Opus 4.8 (1M context) <noreply@anthropic.com>
</commit_message>
<xml_diff>
--- a/Blower_Offer_Template.docx
+++ b/Blower_Offer_Template.docx
@@ -385,26 +385,6 @@
     </w:p>
     <w:p>
       <w:pPr>
-        <w:pStyle w:val="Heading1"/>
-        <w:pBdr>
-          <w:bottom w:val="single" w:color="E87722" w:sz="12" w:space="4"/>
-        </w:pBdr>
-        <w:spacing w:after="200" w:before="360"/>
-      </w:pPr>
-      <w:r>
-        <w:rPr>
-          <w:rFonts w:ascii="Calibri" w:cs="Calibri" w:eastAsia="Calibri" w:hAnsi="Calibri"/>
-          <w:b/>
-          <w:bCs/>
-          <w:color w:val="1F2937"/>
-          <w:sz w:val="32"/>
-          <w:szCs w:val="32"/>
-        </w:rPr>
-        <w:t>COVER LETTER</w:t>
-      </w:r>
-    </w:p>
-    <w:p>
-      <w:pPr>
         <w:jc w:val="left"/>
       </w:pPr>
       <w:r>
@@ -628,7 +608,25 @@
           <w:sz w:val="22"/>
           <w:u w:val="none"/>
         </w:rPr>
-        <w:t>Thank you for your enquiry regarding your requirement of our {{equipment_name}}. Please find attached herewith our offer for the same.</w:t>
+        <w:t xml:space="preserve">Thank you for your enquiry regarding your requirement of our </w:t>
+      </w:r>
+      <w:r>
+        <w:rPr>
+          <w:rFonts w:ascii="Calibri" w:hAnsi="Calibri"/>
+          <w:b/>
+          <w:sz w:val="22"/>
+          <w:u w:val="none"/>
+        </w:rPr>
+        <w:t xml:space="preserve">{{equipment_name}}</w:t>
+      </w:r>
+      <w:r>
+        <w:rPr>
+          <w:rFonts w:ascii="Calibri" w:hAnsi="Calibri"/>
+          <w:b w:val="0"/>
+          <w:sz w:val="22"/>
+          <w:u w:val="none"/>
+        </w:rPr>
+        <w:t xml:space="preserve">. Please find attached herewith our offer for the same.</w:t>
       </w:r>
     </w:p>
     <w:p>

</xml_diff>

<commit_message>
style: move blower spec table into Scope of Supply (Annexure I)
Relocate the detailed Blower Specifications table from the "2. Technical
Specifications" section into "Annexure I – Scope of Supply: Blower" (after the
scope intro line), drop the now-empty Technical Specifications heading, and
remove its stale Table-of-Contents entry.

Co-Authored-By: Claude Opus 4.8 (1M context) <noreply@anthropic.com>
</commit_message>
<xml_diff>
--- a/Blower_Offer_Template.docx
+++ b/Blower_Offer_Template.docx
@@ -1069,74 +1069,6 @@
           </w:p>
         </w:tc>
       </w:tr>
-      <w:tr>
-        <w:tc>
-          <w:tcPr>
-            <w:tcW w:type="dxa" w:w="1200"/>
-            <w:tcBorders>
-              <w:top w:val="single" w:color="BFBFBF" w:sz="4"/>
-              <w:left w:val="single" w:color="BFBFBF" w:sz="4"/>
-              <w:bottom w:val="single" w:color="BFBFBF" w:sz="4"/>
-              <w:right w:val="single" w:color="BFBFBF" w:sz="4"/>
-            </w:tcBorders>
-            <w:shd w:fill="F3F4F6" w:val="clear"/>
-            <w:tcMar>
-              <w:top w:type="dxa" w:w="100"/>
-              <w:left w:type="dxa" w:w="140"/>
-              <w:bottom w:type="dxa" w:w="100"/>
-              <w:right w:type="dxa" w:w="140"/>
-            </w:tcMar>
-            <w:vAlign w:val="center"/>
-          </w:tcPr>
-          <w:p>
-            <w:pPr>
-              <w:spacing w:after="40" w:before="40"/>
-              <w:jc w:val="center"/>
-            </w:pPr>
-            <w:r>
-              <w:rPr>
-                <w:rFonts w:ascii="Calibri" w:cs="Calibri" w:eastAsia="Calibri" w:hAnsi="Calibri"/>
-                <w:sz w:val="22"/>
-                <w:szCs w:val="22"/>
-              </w:rPr>
-              <w:t>2</w:t>
-            </w:r>
-          </w:p>
-        </w:tc>
-        <w:tc>
-          <w:tcPr>
-            <w:tcW w:type="dxa" w:w="8160"/>
-            <w:tcBorders>
-              <w:top w:val="single" w:color="BFBFBF" w:sz="4"/>
-              <w:left w:val="single" w:color="BFBFBF" w:sz="4"/>
-              <w:bottom w:val="single" w:color="BFBFBF" w:sz="4"/>
-              <w:right w:val="single" w:color="BFBFBF" w:sz="4"/>
-            </w:tcBorders>
-            <w:shd w:fill="F3F4F6" w:val="clear"/>
-            <w:tcMar>
-              <w:top w:type="dxa" w:w="100"/>
-              <w:left w:type="dxa" w:w="140"/>
-              <w:bottom w:type="dxa" w:w="100"/>
-              <w:right w:type="dxa" w:w="140"/>
-            </w:tcMar>
-            <w:vAlign w:val="center"/>
-          </w:tcPr>
-          <w:p>
-            <w:pPr>
-              <w:spacing w:after="40" w:before="40"/>
-              <w:jc w:val="left"/>
-            </w:pPr>
-            <w:r>
-              <w:rPr>
-                <w:rFonts w:ascii="Calibri" w:cs="Calibri" w:eastAsia="Calibri" w:hAnsi="Calibri"/>
-                <w:sz w:val="22"/>
-                <w:szCs w:val="22"/>
-              </w:rPr>
-              <w:t xml:space="preserve">Technical Specifications</w:t>
-            </w:r>
-          </w:p>
-        </w:tc>
-      </w:tr>
     </w:tbl>
     <w:p>
       <w:pPr>
@@ -2232,6 +2164,14 @@
     </w:p>
     <w:p>
       <w:pPr>
+        <w:spacing w:after="200" w:before="200"/>
+      </w:pPr>
+      <w:r>
+        <w:t xml:space="preserve"/>
+      </w:r>
+    </w:p>
+    <w:p>
+      <w:pPr>
         <w:pStyle w:val="Heading1"/>
         <w:pBdr>
           <w:bottom w:val="single" w:color="E87722" w:sz="12" w:space="4"/>
@@ -2247,24 +2187,19 @@
           <w:sz w:val="32"/>
           <w:szCs w:val="32"/>
         </w:rPr>
-        <w:t>2. TECHNICAL SPECIFICATIONS</w:t>
-      </w:r>
-    </w:p>
-    <w:p>
-      <w:pPr>
-        <w:pStyle w:val="Heading2"/>
-        <w:spacing w:after="120" w:before="280"/>
+        <w:t>ANNEXURE I — SCOPE OF SUPPLY: BLOWER</w:t>
+      </w:r>
+    </w:p>
+    <w:p>
+      <w:pPr>
+        <w:spacing w:after="160" w:before="60" w:line="300"/>
+        <w:jc w:val="left"/>
       </w:pPr>
       <w:r>
         <w:rPr>
           <w:rFonts w:ascii="Calibri" w:cs="Calibri" w:eastAsia="Calibri" w:hAnsi="Calibri"/>
-          <w:b/>
-          <w:bCs/>
-          <w:color w:val="E87722"/>
-          <w:sz w:val="26"/>
-          <w:szCs w:val="26"/>
-        </w:rPr>
-        <w:t xml:space="preserve">BLOWER</w:t>
+        </w:rPr>
+        <w:t>{{ scope_intro }}</w:t>
       </w:r>
     </w:p>
     <w:tbl>
@@ -2528,46 +2463,6 @@
         </w:tc>
       </w:tr>
     </w:tbl>
-    <w:p>
-      <w:pPr>
-        <w:spacing w:after="200" w:before="200"/>
-      </w:pPr>
-      <w:r>
-        <w:t xml:space="preserve"/>
-      </w:r>
-    </w:p>
-    <w:p>
-      <w:pPr>
-        <w:pStyle w:val="Heading1"/>
-        <w:pBdr>
-          <w:bottom w:val="single" w:color="E87722" w:sz="12" w:space="4"/>
-        </w:pBdr>
-        <w:spacing w:after="200" w:before="360"/>
-      </w:pPr>
-      <w:r>
-        <w:rPr>
-          <w:rFonts w:ascii="Calibri" w:cs="Calibri" w:eastAsia="Calibri" w:hAnsi="Calibri"/>
-          <w:b/>
-          <w:bCs/>
-          <w:color w:val="1F2937"/>
-          <w:sz w:val="32"/>
-          <w:szCs w:val="32"/>
-        </w:rPr>
-        <w:t>ANNEXURE I — SCOPE OF SUPPLY: BLOWER</w:t>
-      </w:r>
-    </w:p>
-    <w:p>
-      <w:pPr>
-        <w:spacing w:after="160" w:before="60" w:line="300"/>
-        <w:jc w:val="left"/>
-      </w:pPr>
-      <w:r>
-        <w:rPr>
-          <w:rFonts w:ascii="Calibri" w:cs="Calibri" w:eastAsia="Calibri" w:hAnsi="Calibri"/>
-        </w:rPr>
-        <w:t>{{ scope_intro }}</w:t>
-      </w:r>
-    </w:p>
     <w:p>
       <w:pPr>
         <w:pStyle w:val="ListParagraph"/>

</xml_diff>

<commit_message>
style: move Advantages section right after Scope of Supply (HPU/PU/Blower/Burner)
Relocate the whole Advantages block ({{ adv_title }} → adv_closing loop) from
the end of the offer to just before Annexure II – Price Schedule, so the order
reads Scope of Supply → Advantages → Price Schedule → Terms & Conditions. All
docxtpl {%p%} loop pairs kept intact; rendered-tested on all four templates.

Co-Authored-By: Claude Opus 4.8 (1M context) <noreply@anthropic.com>
</commit_message>
<xml_diff>
--- a/Blower_Offer_Template.docx
+++ b/Blower_Offer_Template.docx
@@ -2495,6 +2495,283 @@
       <w:pPr>
         <w:pStyle w:val="Heading1"/>
         <w:pBdr>
+          <w:bottom w:val="single" w:color="595959" w:sz="12" w:space="4"/>
+        </w:pBdr>
+        <w:spacing w:after="200" w:before="360"/>
+      </w:pPr>
+      <w:r>
+        <w:t>{{ adv_title }}</w:t>
+      </w:r>
+    </w:p>
+    <w:p>
+      <w:pPr>
+        <w:spacing w:before="0" w:after="40"/>
+      </w:pPr>
+      <w:r>
+        <w:rPr>
+          <w:rFonts w:ascii="Calibri" w:hAnsi="Calibri"/>
+          <w:b w:val="0"/>
+          <w:i w:val="0"/>
+          <w:sz w:val="22"/>
+        </w:rPr>
+        <w:t>{%p for x in adv_items %}</w:t>
+      </w:r>
+    </w:p>
+    <w:p>
+      <w:pPr>
+        <w:spacing w:before="0" w:after="40"/>
+      </w:pPr>
+      <w:r>
+        <w:rPr>
+          <w:rFonts w:ascii="Calibri" w:hAnsi="Calibri"/>
+          <w:b w:val="0"/>
+          <w:i w:val="0"/>
+          <w:sz w:val="22"/>
+        </w:rPr>
+        <w:t>•  {{ x.item }}</w:t>
+      </w:r>
+    </w:p>
+    <w:p>
+      <w:pPr>
+        <w:spacing w:before="0" w:after="40"/>
+      </w:pPr>
+      <w:r>
+        <w:rPr>
+          <w:rFonts w:ascii="Calibri" w:hAnsi="Calibri"/>
+          <w:b w:val="0"/>
+          <w:i w:val="0"/>
+          <w:sz w:val="22"/>
+        </w:rPr>
+        <w:t>{%p endfor %}</w:t>
+      </w:r>
+    </w:p>
+    <w:p>
+      <w:pPr>
+        <w:spacing w:before="0" w:after="40"/>
+      </w:pPr>
+      <w:r>
+        <w:rPr>
+          <w:rFonts w:ascii="Calibri" w:hAnsi="Calibri"/>
+          <w:b w:val="0"/>
+          <w:i w:val="0"/>
+          <w:sz w:val="22"/>
+        </w:rPr>
+        <w:t>{%p if adv_sub1_title %}</w:t>
+      </w:r>
+    </w:p>
+    <w:p>
+      <w:pPr>
+        <w:spacing w:before="200" w:after="40"/>
+      </w:pPr>
+      <w:r>
+        <w:rPr>
+          <w:rFonts w:ascii="Calibri" w:hAnsi="Calibri"/>
+          <w:b/>
+          <w:i w:val="0"/>
+          <w:sz w:val="22"/>
+        </w:rPr>
+        <w:t>{{ adv_sub1_title }}</w:t>
+      </w:r>
+    </w:p>
+    <w:p>
+      <w:pPr>
+        <w:spacing w:before="0" w:after="40"/>
+      </w:pPr>
+      <w:r>
+        <w:rPr>
+          <w:rFonts w:ascii="Calibri" w:hAnsi="Calibri"/>
+          <w:b w:val="0"/>
+          <w:i w:val="0"/>
+          <w:sz w:val="22"/>
+        </w:rPr>
+        <w:t>{%p endif %}</w:t>
+      </w:r>
+    </w:p>
+    <w:p>
+      <w:pPr>
+        <w:spacing w:before="0" w:after="40"/>
+      </w:pPr>
+      <w:r>
+        <w:rPr>
+          <w:rFonts w:ascii="Calibri" w:hAnsi="Calibri"/>
+          <w:b w:val="0"/>
+          <w:i w:val="0"/>
+          <w:sz w:val="22"/>
+        </w:rPr>
+        <w:t>{%p for x in adv_sub1_items %}</w:t>
+      </w:r>
+    </w:p>
+    <w:p>
+      <w:pPr>
+        <w:spacing w:before="0" w:after="40"/>
+      </w:pPr>
+      <w:r>
+        <w:rPr>
+          <w:rFonts w:ascii="Calibri" w:hAnsi="Calibri"/>
+          <w:b w:val="0"/>
+          <w:i w:val="0"/>
+          <w:sz w:val="22"/>
+        </w:rPr>
+        <w:t>•  {{ x.item }}</w:t>
+      </w:r>
+    </w:p>
+    <w:p>
+      <w:pPr>
+        <w:spacing w:before="0" w:after="40"/>
+      </w:pPr>
+      <w:r>
+        <w:rPr>
+          <w:rFonts w:ascii="Calibri" w:hAnsi="Calibri"/>
+          <w:b w:val="0"/>
+          <w:i w:val="0"/>
+          <w:sz w:val="22"/>
+        </w:rPr>
+        <w:t>{%p endfor %}</w:t>
+      </w:r>
+    </w:p>
+    <w:p>
+      <w:pPr>
+        <w:spacing w:before="0" w:after="40"/>
+      </w:pPr>
+      <w:r>
+        <w:rPr>
+          <w:rFonts w:ascii="Calibri" w:hAnsi="Calibri"/>
+          <w:b w:val="0"/>
+          <w:i w:val="0"/>
+          <w:sz w:val="22"/>
+        </w:rPr>
+        <w:t>{%p if adv_sub2_title %}</w:t>
+      </w:r>
+    </w:p>
+    <w:p>
+      <w:pPr>
+        <w:spacing w:before="200" w:after="40"/>
+      </w:pPr>
+      <w:r>
+        <w:rPr>
+          <w:rFonts w:ascii="Calibri" w:hAnsi="Calibri"/>
+          <w:b/>
+          <w:i w:val="0"/>
+          <w:sz w:val="22"/>
+        </w:rPr>
+        <w:t>{{ adv_sub2_title }}</w:t>
+      </w:r>
+    </w:p>
+    <w:p>
+      <w:pPr>
+        <w:spacing w:before="0" w:after="40"/>
+      </w:pPr>
+      <w:r>
+        <w:rPr>
+          <w:rFonts w:ascii="Calibri" w:hAnsi="Calibri"/>
+          <w:b w:val="0"/>
+          <w:i w:val="0"/>
+          <w:sz w:val="22"/>
+        </w:rPr>
+        <w:t>{%p endif %}</w:t>
+      </w:r>
+    </w:p>
+    <w:p>
+      <w:pPr>
+        <w:spacing w:before="0" w:after="40"/>
+      </w:pPr>
+      <w:r>
+        <w:rPr>
+          <w:rFonts w:ascii="Calibri" w:hAnsi="Calibri"/>
+          <w:b w:val="0"/>
+          <w:i w:val="0"/>
+          <w:sz w:val="22"/>
+        </w:rPr>
+        <w:t>{%p for x in adv_sub2_items %}</w:t>
+      </w:r>
+    </w:p>
+    <w:p>
+      <w:pPr>
+        <w:spacing w:before="0" w:after="40"/>
+      </w:pPr>
+      <w:r>
+        <w:rPr>
+          <w:rFonts w:ascii="Calibri" w:hAnsi="Calibri"/>
+          <w:b w:val="0"/>
+          <w:i w:val="0"/>
+          <w:sz w:val="22"/>
+        </w:rPr>
+        <w:t>•  {{ x.item }}</w:t>
+      </w:r>
+    </w:p>
+    <w:p>
+      <w:pPr>
+        <w:spacing w:before="0" w:after="40"/>
+      </w:pPr>
+      <w:r>
+        <w:rPr>
+          <w:rFonts w:ascii="Calibri" w:hAnsi="Calibri"/>
+          <w:b w:val="0"/>
+          <w:i w:val="0"/>
+          <w:sz w:val="22"/>
+        </w:rPr>
+        <w:t>{%p endfor %}</w:t>
+      </w:r>
+    </w:p>
+    <w:p>
+      <w:pPr>
+        <w:spacing w:before="0" w:after="40"/>
+      </w:pPr>
+      <w:r>
+        <w:rPr>
+          <w:rFonts w:ascii="Calibri" w:hAnsi="Calibri"/>
+          <w:b w:val="0"/>
+          <w:i w:val="0"/>
+          <w:sz w:val="22"/>
+        </w:rPr>
+      </w:r>
+    </w:p>
+    <w:p>
+      <w:pPr>
+        <w:spacing w:before="0" w:after="40"/>
+      </w:pPr>
+      <w:r>
+        <w:rPr>
+          <w:rFonts w:ascii="Calibri" w:hAnsi="Calibri"/>
+          <w:b w:val="0"/>
+          <w:i w:val="0"/>
+          <w:sz w:val="22"/>
+        </w:rPr>
+        <w:t>{%p for x in adv_closing %}</w:t>
+      </w:r>
+    </w:p>
+    <w:p>
+      <w:pPr>
+        <w:spacing w:before="160" w:after="40"/>
+      </w:pPr>
+      <w:r>
+        <w:rPr>
+          <w:rFonts w:ascii="Calibri" w:hAnsi="Calibri"/>
+          <w:b/>
+          <w:i/>
+          <w:sz w:val="22"/>
+        </w:rPr>
+        <w:t>{{ x.item }}</w:t>
+      </w:r>
+    </w:p>
+    <w:p>
+      <w:pPr>
+        <w:spacing w:before="0" w:after="40"/>
+      </w:pPr>
+      <w:r>
+        <w:rPr>
+          <w:rFonts w:ascii="Calibri" w:hAnsi="Calibri"/>
+          <w:b w:val="0"/>
+          <w:i w:val="0"/>
+          <w:sz w:val="22"/>
+        </w:rPr>
+        <w:t>{%p endfor %}</w:t>
+      </w:r>
+    </w:p>
+    <w:p>
+      <w:pPr>
+        <w:pStyle w:val="Heading1"/>
+        <w:pBdr>
           <w:bottom w:val="single" w:color="E87722" w:sz="12" w:space="4"/>
         </w:pBdr>
         <w:spacing w:after="200" w:before="360"/>
@@ -3677,283 +3954,6 @@
         </w:tc>
       </w:tr>
     </w:tbl>
-    <w:p>
-      <w:pPr>
-        <w:pStyle w:val="Heading1"/>
-        <w:pBdr>
-          <w:bottom w:val="single" w:color="595959" w:sz="12" w:space="4"/>
-        </w:pBdr>
-        <w:spacing w:after="200" w:before="360"/>
-      </w:pPr>
-      <w:r>
-        <w:t>{{ adv_title }}</w:t>
-      </w:r>
-    </w:p>
-    <w:p>
-      <w:pPr>
-        <w:spacing w:before="0" w:after="40"/>
-      </w:pPr>
-      <w:r>
-        <w:rPr>
-          <w:rFonts w:ascii="Calibri" w:hAnsi="Calibri"/>
-          <w:b w:val="0"/>
-          <w:i w:val="0"/>
-          <w:sz w:val="22"/>
-        </w:rPr>
-        <w:t>{%p for x in adv_items %}</w:t>
-      </w:r>
-    </w:p>
-    <w:p>
-      <w:pPr>
-        <w:spacing w:before="0" w:after="40"/>
-      </w:pPr>
-      <w:r>
-        <w:rPr>
-          <w:rFonts w:ascii="Calibri" w:hAnsi="Calibri"/>
-          <w:b w:val="0"/>
-          <w:i w:val="0"/>
-          <w:sz w:val="22"/>
-        </w:rPr>
-        <w:t>•  {{ x.item }}</w:t>
-      </w:r>
-    </w:p>
-    <w:p>
-      <w:pPr>
-        <w:spacing w:before="0" w:after="40"/>
-      </w:pPr>
-      <w:r>
-        <w:rPr>
-          <w:rFonts w:ascii="Calibri" w:hAnsi="Calibri"/>
-          <w:b w:val="0"/>
-          <w:i w:val="0"/>
-          <w:sz w:val="22"/>
-        </w:rPr>
-        <w:t>{%p endfor %}</w:t>
-      </w:r>
-    </w:p>
-    <w:p>
-      <w:pPr>
-        <w:spacing w:before="0" w:after="40"/>
-      </w:pPr>
-      <w:r>
-        <w:rPr>
-          <w:rFonts w:ascii="Calibri" w:hAnsi="Calibri"/>
-          <w:b w:val="0"/>
-          <w:i w:val="0"/>
-          <w:sz w:val="22"/>
-        </w:rPr>
-        <w:t>{%p if adv_sub1_title %}</w:t>
-      </w:r>
-    </w:p>
-    <w:p>
-      <w:pPr>
-        <w:spacing w:before="200" w:after="40"/>
-      </w:pPr>
-      <w:r>
-        <w:rPr>
-          <w:rFonts w:ascii="Calibri" w:hAnsi="Calibri"/>
-          <w:b/>
-          <w:i w:val="0"/>
-          <w:sz w:val="22"/>
-        </w:rPr>
-        <w:t>{{ adv_sub1_title }}</w:t>
-      </w:r>
-    </w:p>
-    <w:p>
-      <w:pPr>
-        <w:spacing w:before="0" w:after="40"/>
-      </w:pPr>
-      <w:r>
-        <w:rPr>
-          <w:rFonts w:ascii="Calibri" w:hAnsi="Calibri"/>
-          <w:b w:val="0"/>
-          <w:i w:val="0"/>
-          <w:sz w:val="22"/>
-        </w:rPr>
-        <w:t>{%p endif %}</w:t>
-      </w:r>
-    </w:p>
-    <w:p>
-      <w:pPr>
-        <w:spacing w:before="0" w:after="40"/>
-      </w:pPr>
-      <w:r>
-        <w:rPr>
-          <w:rFonts w:ascii="Calibri" w:hAnsi="Calibri"/>
-          <w:b w:val="0"/>
-          <w:i w:val="0"/>
-          <w:sz w:val="22"/>
-        </w:rPr>
-        <w:t>{%p for x in adv_sub1_items %}</w:t>
-      </w:r>
-    </w:p>
-    <w:p>
-      <w:pPr>
-        <w:spacing w:before="0" w:after="40"/>
-      </w:pPr>
-      <w:r>
-        <w:rPr>
-          <w:rFonts w:ascii="Calibri" w:hAnsi="Calibri"/>
-          <w:b w:val="0"/>
-          <w:i w:val="0"/>
-          <w:sz w:val="22"/>
-        </w:rPr>
-        <w:t>•  {{ x.item }}</w:t>
-      </w:r>
-    </w:p>
-    <w:p>
-      <w:pPr>
-        <w:spacing w:before="0" w:after="40"/>
-      </w:pPr>
-      <w:r>
-        <w:rPr>
-          <w:rFonts w:ascii="Calibri" w:hAnsi="Calibri"/>
-          <w:b w:val="0"/>
-          <w:i w:val="0"/>
-          <w:sz w:val="22"/>
-        </w:rPr>
-        <w:t>{%p endfor %}</w:t>
-      </w:r>
-    </w:p>
-    <w:p>
-      <w:pPr>
-        <w:spacing w:before="0" w:after="40"/>
-      </w:pPr>
-      <w:r>
-        <w:rPr>
-          <w:rFonts w:ascii="Calibri" w:hAnsi="Calibri"/>
-          <w:b w:val="0"/>
-          <w:i w:val="0"/>
-          <w:sz w:val="22"/>
-        </w:rPr>
-        <w:t>{%p if adv_sub2_title %}</w:t>
-      </w:r>
-    </w:p>
-    <w:p>
-      <w:pPr>
-        <w:spacing w:before="200" w:after="40"/>
-      </w:pPr>
-      <w:r>
-        <w:rPr>
-          <w:rFonts w:ascii="Calibri" w:hAnsi="Calibri"/>
-          <w:b/>
-          <w:i w:val="0"/>
-          <w:sz w:val="22"/>
-        </w:rPr>
-        <w:t>{{ adv_sub2_title }}</w:t>
-      </w:r>
-    </w:p>
-    <w:p>
-      <w:pPr>
-        <w:spacing w:before="0" w:after="40"/>
-      </w:pPr>
-      <w:r>
-        <w:rPr>
-          <w:rFonts w:ascii="Calibri" w:hAnsi="Calibri"/>
-          <w:b w:val="0"/>
-          <w:i w:val="0"/>
-          <w:sz w:val="22"/>
-        </w:rPr>
-        <w:t>{%p endif %}</w:t>
-      </w:r>
-    </w:p>
-    <w:p>
-      <w:pPr>
-        <w:spacing w:before="0" w:after="40"/>
-      </w:pPr>
-      <w:r>
-        <w:rPr>
-          <w:rFonts w:ascii="Calibri" w:hAnsi="Calibri"/>
-          <w:b w:val="0"/>
-          <w:i w:val="0"/>
-          <w:sz w:val="22"/>
-        </w:rPr>
-        <w:t>{%p for x in adv_sub2_items %}</w:t>
-      </w:r>
-    </w:p>
-    <w:p>
-      <w:pPr>
-        <w:spacing w:before="0" w:after="40"/>
-      </w:pPr>
-      <w:r>
-        <w:rPr>
-          <w:rFonts w:ascii="Calibri" w:hAnsi="Calibri"/>
-          <w:b w:val="0"/>
-          <w:i w:val="0"/>
-          <w:sz w:val="22"/>
-        </w:rPr>
-        <w:t>•  {{ x.item }}</w:t>
-      </w:r>
-    </w:p>
-    <w:p>
-      <w:pPr>
-        <w:spacing w:before="0" w:after="40"/>
-      </w:pPr>
-      <w:r>
-        <w:rPr>
-          <w:rFonts w:ascii="Calibri" w:hAnsi="Calibri"/>
-          <w:b w:val="0"/>
-          <w:i w:val="0"/>
-          <w:sz w:val="22"/>
-        </w:rPr>
-        <w:t>{%p endfor %}</w:t>
-      </w:r>
-    </w:p>
-    <w:p>
-      <w:pPr>
-        <w:spacing w:before="0" w:after="40"/>
-      </w:pPr>
-      <w:r>
-        <w:rPr>
-          <w:rFonts w:ascii="Calibri" w:hAnsi="Calibri"/>
-          <w:b w:val="0"/>
-          <w:i w:val="0"/>
-          <w:sz w:val="22"/>
-        </w:rPr>
-      </w:r>
-    </w:p>
-    <w:p>
-      <w:pPr>
-        <w:spacing w:before="0" w:after="40"/>
-      </w:pPr>
-      <w:r>
-        <w:rPr>
-          <w:rFonts w:ascii="Calibri" w:hAnsi="Calibri"/>
-          <w:b w:val="0"/>
-          <w:i w:val="0"/>
-          <w:sz w:val="22"/>
-        </w:rPr>
-        <w:t>{%p for x in adv_closing %}</w:t>
-      </w:r>
-    </w:p>
-    <w:p>
-      <w:pPr>
-        <w:spacing w:before="160" w:after="40"/>
-      </w:pPr>
-      <w:r>
-        <w:rPr>
-          <w:rFonts w:ascii="Calibri" w:hAnsi="Calibri"/>
-          <w:b/>
-          <w:i/>
-          <w:sz w:val="22"/>
-        </w:rPr>
-        <w:t>{{ x.item }}</w:t>
-      </w:r>
-    </w:p>
-    <w:p>
-      <w:pPr>
-        <w:spacing w:before="0" w:after="40"/>
-      </w:pPr>
-      <w:r>
-        <w:rPr>
-          <w:rFonts w:ascii="Calibri" w:hAnsi="Calibri"/>
-          <w:b w:val="0"/>
-          <w:i w:val="0"/>
-          <w:sz w:val="22"/>
-        </w:rPr>
-        <w:t>{%p endfor %}</w:t>
-      </w:r>
-    </w:p>
     <w:sectPr>
       <w:headerReference w:type="default" r:id="rId9"/>
       <w:footerReference w:type="default" r:id="rId10"/>

</xml_diff>

<commit_message>
fix: header rule same length as heading rule in equipment offers
The page header table (logo + Ref line) was 9360 tw wide while the body text
(and the heading underline) is 9740 tw, so the header's orange rule was ~380 tw
shorter than the "1. ABOUT THE CLIENT" rule. Widen the header table's right
column to the full text width so both orange rules match. Applied to HPU, PU,
Blower and Burner offer templates.

Co-Authored-By: Claude Opus 4.8 (1M context) <noreply@anthropic.com>
</commit_message>
<xml_diff>
--- a/Blower_Offer_Template.docx
+++ b/Blower_Offer_Template.docx
@@ -376,6 +376,7 @@
           <w:headerReference w:type="default" r:id="rId7"/>
           <w:footerReference w:type="default" r:id="rId8"/>
           <w:headerReference w:type="first" r:id="rId13"/>
+          <w:headerReference w:type="even" r:id="rId17"/>
           <w:pgSz w:w="11906" w:h="16838" w:orient="portrait"/>
           <w:pgMar w:top="1440" w:right="1083" w:bottom="1440" w:left="1083" w:header="708" w:footer="708" w:gutter="0"/>
           <w:pgNumType/>
@@ -4337,7 +4338,7 @@
     </w:tblPr>
     <w:tblGrid>
       <w:gridCol w:w="1600"/>
-      <w:gridCol w:w="7760"/>
+      <w:gridCol w:w="8140"/>
     </w:tblGrid>
     <w:tr>
       <w:tc>
@@ -4430,6 +4431,16 @@
 </file>
 
 <file path=word/header3.xml><?xml version="1.0" encoding="utf-8"?>
+<w:hdr xmlns:m="http://schemas.openxmlformats.org/officeDocument/2006/math" xmlns:mc="http://schemas.openxmlformats.org/markup-compatibility/2006" xmlns:mo="http://schemas.microsoft.com/office/mac/office/2008/main" xmlns:mv="urn:schemas-microsoft-com:mac:vml" xmlns:o="urn:schemas-microsoft-com:office:office" xmlns:r="http://schemas.openxmlformats.org/officeDocument/2006/relationships" xmlns:v="urn:schemas-microsoft-com:vml" xmlns:w10="urn:schemas-microsoft-com:office:word" xmlns:w14="http://schemas.microsoft.com/office/word/2010/wordml" xmlns:w="http://schemas.openxmlformats.org/wordprocessingml/2006/main" xmlns:wne="http://schemas.microsoft.com/office/word/2006/wordml" xmlns:wp14="http://schemas.microsoft.com/office/word/2010/wordprocessingDrawing" xmlns:wp="http://schemas.openxmlformats.org/drawingml/2006/wordprocessingDrawing" xmlns:wpc="http://schemas.microsoft.com/office/word/2010/wordprocessingCanvas" xmlns:wpg="http://schemas.microsoft.com/office/word/2010/wordprocessingGroup" xmlns:wpi="http://schemas.microsoft.com/office/word/2010/wordprocessingInk" xmlns:wps="http://schemas.microsoft.com/office/word/2010/wordprocessingShape" mc:Ignorable="w14 wp14">
+  <w:p>
+    <w:pPr>
+      <w:pStyle w:val="Header"/>
+    </w:pPr>
+  </w:p>
+</w:hdr>
+</file>
+
+<file path=word/header4.xml><?xml version="1.0" encoding="utf-8"?>
 <w:hdr xmlns:m="http://schemas.openxmlformats.org/officeDocument/2006/math" xmlns:mc="http://schemas.openxmlformats.org/markup-compatibility/2006" xmlns:mo="http://schemas.microsoft.com/office/mac/office/2008/main" xmlns:mv="urn:schemas-microsoft-com:mac:vml" xmlns:o="urn:schemas-microsoft-com:office:office" xmlns:r="http://schemas.openxmlformats.org/officeDocument/2006/relationships" xmlns:v="urn:schemas-microsoft-com:vml" xmlns:w10="urn:schemas-microsoft-com:office:word" xmlns:w14="http://schemas.microsoft.com/office/word/2010/wordml" xmlns:w="http://schemas.openxmlformats.org/wordprocessingml/2006/main" xmlns:wne="http://schemas.microsoft.com/office/word/2006/wordml" xmlns:wp14="http://schemas.microsoft.com/office/word/2010/wordprocessingDrawing" xmlns:wp="http://schemas.openxmlformats.org/drawingml/2006/wordprocessingDrawing" xmlns:wpc="http://schemas.microsoft.com/office/word/2010/wordprocessingCanvas" xmlns:wpg="http://schemas.microsoft.com/office/word/2010/wordprocessingGroup" xmlns:wpi="http://schemas.microsoft.com/office/word/2010/wordprocessingInk" xmlns:wps="http://schemas.microsoft.com/office/word/2010/wordprocessingShape" mc:Ignorable="w14 wp14">
   <w:p>
     <w:pPr>

</xml_diff>

<commit_message>
fix: header rule now truly equals heading rule + orange advantages rule
The header-rule length fix in 1487f30 only updated gridCols to 9740 but left
three inconsistent width sources on the header table (tblW=9360, tcW=1800+7760,
gridCols=1600+8140) with no fixed layout, so LibreOffice autofit rendered the
rule at the wrong length. Pin tblW=9740, tcW=[1600,8140], tblLayout=fixed on all
4 equipment templates so the header rule matches the 9740-wide heading/annexure
paragraph rules exactly. Also normalise the ADVANTAGES heading rule from grey
595959 to orange E87722 to match every other section heading.

Co-Authored-By: Claude Opus 4.8 (1M context) <noreply@anthropic.com>
</commit_message>
<xml_diff>
--- a/Blower_Offer_Template.docx
+++ b/Blower_Offer_Template.docx
@@ -2496,7 +2496,7 @@
       <w:pPr>
         <w:pStyle w:val="Heading1"/>
         <w:pBdr>
-          <w:bottom w:val="single" w:color="595959" w:sz="12" w:space="4"/>
+          <w:bottom w:val="single" w:color="E87722" w:sz="12" w:space="4"/>
         </w:pBdr>
         <w:spacing w:after="200" w:before="360"/>
       </w:pPr>
@@ -4326,7 +4326,7 @@
 <w:hdr xmlns:wpc="http://schemas.microsoft.com/office/word/2010/wordprocessingCanvas" xmlns:mc="http://schemas.openxmlformats.org/markup-compatibility/2006" xmlns:o="urn:schemas-microsoft-com:office:office" xmlns:r="http://schemas.openxmlformats.org/officeDocument/2006/relationships" xmlns:m="http://schemas.openxmlformats.org/officeDocument/2006/math" xmlns:v="urn:schemas-microsoft-com:vml" xmlns:wp14="http://schemas.microsoft.com/office/word/2010/wordprocessingDrawing" xmlns:wp="http://schemas.openxmlformats.org/drawingml/2006/wordprocessingDrawing" xmlns:w10="urn:schemas-microsoft-com:office:word" xmlns:w="http://schemas.openxmlformats.org/wordprocessingml/2006/main" xmlns:w14="http://schemas.microsoft.com/office/word/2010/wordml" xmlns:w15="http://schemas.microsoft.com/office/word/2012/wordml" xmlns:wpg="http://schemas.microsoft.com/office/word/2010/wordprocessingGroup" xmlns:wpi="http://schemas.microsoft.com/office/word/2010/wordprocessingInk" xmlns:wne="http://schemas.microsoft.com/office/word/2006/wordml" xmlns:wps="http://schemas.microsoft.com/office/word/2010/wordprocessingShape" xmlns:cx="http://schemas.microsoft.com/office/drawing/2014/chartex" xmlns:cx1="http://schemas.microsoft.com/office/drawing/2015/9/8/chartex" xmlns:cx2="http://schemas.microsoft.com/office/drawing/2015/10/21/chartex" xmlns:cx3="http://schemas.microsoft.com/office/drawing/2016/5/9/chartex" xmlns:cx4="http://schemas.microsoft.com/office/drawing/2016/5/10/chartex" xmlns:cx5="http://schemas.microsoft.com/office/drawing/2016/5/11/chartex" xmlns:cx6="http://schemas.microsoft.com/office/drawing/2016/5/12/chartex" xmlns:cx7="http://schemas.microsoft.com/office/drawing/2016/5/13/chartex" xmlns:cx8="http://schemas.microsoft.com/office/drawing/2016/5/14/chartex" xmlns:w16cid="http://schemas.microsoft.com/office/word/2016/wordml/cid" xmlns:w16se="http://schemas.microsoft.com/office/word/2015/wordml/symex">
   <w:tbl>
     <w:tblPr>
-      <w:tblW w:type="dxa" w:w="9360"/>
+      <w:tblW w:type="dxa" w:w="9740"/>
       <w:tblBorders>
         <w:top w:val="none" w:color="FFFFFF" w:sz="0"/>
         <w:left w:val="none" w:color="FFFFFF" w:sz="0"/>
@@ -4335,6 +4335,7 @@
         <w:insideH w:val="none" w:color="FFFFFF" w:sz="0"/>
         <w:insideV w:val="none" w:color="FFFFFF" w:sz="0"/>
       </w:tblBorders>
+      <w:tblLayout w:type="fixed"/>
     </w:tblPr>
     <w:tblGrid>
       <w:gridCol w:w="1600"/>
@@ -4343,7 +4344,7 @@
     <w:tr>
       <w:tc>
         <w:tcPr>
-          <w:tcW w:type="dxa" w:w="1800"/>
+          <w:tcW w:type="dxa" w:w="1600"/>
           <w:tcBorders>
             <w:top w:val="none"/>
             <w:left w:val="none"/>
@@ -4400,7 +4401,7 @@
       </w:tc>
       <w:tc>
         <w:tcPr>
-          <w:tcW w:type="dxa" w:w="7760"/>
+          <w:tcW w:type="dxa" w:w="8140"/>
           <w:tcBorders>
             <w:top w:val="none"/>
             <w:left w:val="none"/>

</xml_diff>